<commit_message>
Mod: Updated the docs and adding pdf Malaka | Date: 2026-08-16
</commit_message>
<xml_diff>
--- a/Docs/Palmer_Penguins_Descriptive_Analysis.docx
+++ b/Docs/Palmer_Penguins_Descriptive_Analysis.docx
@@ -5,6 +5,7 @@
     <w:p>
       <w:pPr>
         <w:spacing w:before="2000"/>
+        <w:jc w:val="both"/>
       </w:pPr>
     </w:p>
     <w:p>
@@ -19,13 +20,44 @@
           <w:sz w:val="44"/>
           <w:szCs w:val="44"/>
         </w:rPr>
-        <w:t>DS4102 — Practical Assignment</w:t>
+        <w:t xml:space="preserve">DS4102 </w:t>
+      </w:r>
+      <w:r>
+        <w:rPr>
+          <w:b/>
+          <w:bCs/>
+          <w:sz w:val="44"/>
+          <w:szCs w:val="44"/>
+        </w:rPr>
+        <w:t xml:space="preserve">- </w:t>
+      </w:r>
+      <w:r>
+        <w:rPr>
+          <w:b/>
+          <w:bCs/>
+          <w:sz w:val="44"/>
+          <w:szCs w:val="44"/>
+        </w:rPr>
+        <w:t>Assignment</w:t>
+      </w:r>
+      <w:r>
+        <w:rPr>
+          <w:b/>
+          <w:bCs/>
+          <w:sz w:val="44"/>
+          <w:szCs w:val="44"/>
+        </w:rPr>
+        <w:t xml:space="preserve"> 01</w:t>
       </w:r>
     </w:p>
     <w:p>
       <w:pPr>
         <w:spacing w:after="600"/>
         <w:jc w:val="center"/>
+        <w:rPr>
+          <w:sz w:val="30"/>
+          <w:szCs w:val="30"/>
+        </w:rPr>
       </w:pPr>
       <w:r>
         <w:rPr>
@@ -37,56 +69,47 @@
     </w:p>
     <w:p>
       <w:pPr>
-        <w:spacing w:after="120"/>
+        <w:spacing w:after="600"/>
         <w:jc w:val="center"/>
-      </w:pPr>
-      <w:r>
         <w:rPr>
-          <w:i/>
-          <w:iCs/>
-          <w:sz w:val="22"/>
-          <w:szCs w:val="22"/>
+          <w:sz w:val="30"/>
+          <w:szCs w:val="30"/>
         </w:rPr>
-        <w:t>Dataset: Palmer Penguins (344 observations, 7 variables)</w:t>
-      </w:r>
-    </w:p>
-    <w:p>
-      <w:pPr>
-        <w:spacing w:after="120"/>
+      </w:pPr>
+      <w:r>
+        <w:rPr>
+          <w:sz w:val="30"/>
+          <w:szCs w:val="30"/>
+        </w:rPr>
+        <w:t>A.G.M.S. GUNAWARDHANA</w:t>
+      </w:r>
+    </w:p>
+    <w:p>
+      <w:pPr>
+        <w:spacing w:after="600"/>
         <w:jc w:val="center"/>
-      </w:pPr>
-      <w:r>
         <w:rPr>
-          <w:i/>
-          <w:iCs/>
-          <w:sz w:val="22"/>
-          <w:szCs w:val="22"/>
+          <w:sz w:val="30"/>
+          <w:szCs w:val="30"/>
         </w:rPr>
-        <w:t xml:space="preserve">Tool used: Python (pandas, seaborn, matplotlib, </w:t>
-      </w:r>
-      <w:proofErr w:type="spellStart"/>
+      </w:pPr>
       <w:r>
         <w:rPr>
-          <w:i/>
-          <w:iCs/>
-          <w:sz w:val="22"/>
-          <w:szCs w:val="22"/>
+          <w:sz w:val="30"/>
+          <w:szCs w:val="30"/>
         </w:rPr>
-        <w:t>scipy</w:t>
-      </w:r>
-      <w:proofErr w:type="spellEnd"/>
-      <w:r>
-        <w:rPr>
-          <w:i/>
-          <w:iCs/>
-          <w:sz w:val="22"/>
-          <w:szCs w:val="22"/>
-        </w:rPr>
-        <w:t>)</w:t>
-      </w:r>
-    </w:p>
-    <w:p>
-      <w:pPr>
+        <w:t>DTS/2026/23</w:t>
+      </w:r>
+    </w:p>
+    <w:p>
+      <w:pPr>
+        <w:spacing w:after="600"/>
+        <w:jc w:val="center"/>
+      </w:pPr>
+    </w:p>
+    <w:p>
+      <w:pPr>
+        <w:jc w:val="both"/>
         <w:sectPr>
           <w:pgSz w:w="12240" w:h="15840"/>
           <w:pgMar w:top="1080" w:right="1080" w:bottom="1080" w:left="1080" w:header="708" w:footer="708" w:gutter="0"/>
@@ -99,6 +122,7 @@
       <w:pPr>
         <w:pStyle w:val="Heading1"/>
         <w:spacing w:before="280" w:after="140"/>
+        <w:jc w:val="both"/>
       </w:pPr>
       <w:r>
         <w:lastRenderedPageBreak/>
@@ -108,23 +132,55 @@
     <w:p>
       <w:pPr>
         <w:spacing w:after="120"/>
-      </w:pPr>
-      <w:r>
-        <w:t>This report presents a descriptive analysis of the Palmer Penguins dataset, which records physical measurements for 344 penguins across three species (Adelie, Chinstrap, and Gentoo) sampled from three islands in the Palmer Archipelago, Antarctica. The dataset contains four numeric variables — bill length, bill depth, flipper length, and body mass — and three categorical variables: species, island, and sex.</w:t>
-      </w:r>
-    </w:p>
-    <w:p>
-      <w:pPr>
-        <w:spacing w:after="120"/>
+        <w:jc w:val="both"/>
+      </w:pPr>
+      <w:r>
+        <w:t>This report presents a descriptive analysis of the Palmer Penguins dataset, which records physical measurements for 344 penguins across three species (Adelie, Chinstrap, and Gentoo) sampled from three islands in the Palmer Archipelago, Antarctica. The dataset contains four numeric variables</w:t>
+      </w:r>
+      <w:r>
+        <w:t>,</w:t>
+      </w:r>
+      <w:r>
+        <w:t xml:space="preserve"> bill length, bill depth, flipper length, and body mass</w:t>
+      </w:r>
+      <w:r>
+        <w:t>,</w:t>
+      </w:r>
+      <w:r>
+        <w:t xml:space="preserve"> and three categorical variables: species, island, and sex.</w:t>
+      </w:r>
+    </w:p>
+    <w:p>
+      <w:pPr>
+        <w:spacing w:after="120"/>
+        <w:jc w:val="both"/>
       </w:pPr>
       <w:r>
         <w:t>The goals of this analysis are to: (1) compute descriptive statistics for each variable, (2) visualize the distribution and behavior of each variable, (3) examine how the numeric variables differ across categories such as species and island, and (4) draw conclusions from the observed patterns.</w:t>
       </w:r>
+    </w:p>
+    <w:p>
+      <w:pPr>
+        <w:spacing w:after="120"/>
+        <w:jc w:val="center"/>
+      </w:pPr>
+      <w:r>
+        <w:t xml:space="preserve">More details: </w:t>
+      </w:r>
+      <w:hyperlink r:id="rId7" w:history="1">
+        <w:r>
+          <w:rPr>
+            <w:rStyle w:val="Hyperlink"/>
+          </w:rPr>
+          <w:t>https://github.com/MalakaSupun/Penguins-EDA-Wizard</w:t>
+        </w:r>
+      </w:hyperlink>
     </w:p>
     <w:p>
       <w:pPr>
         <w:pStyle w:val="Heading1"/>
         <w:spacing w:before="280" w:after="140"/>
+        <w:jc w:val="both"/>
       </w:pPr>
       <w:r>
         <w:t>2. Dataset Overview</w:t>
@@ -133,8 +189,17 @@
     <w:p>
       <w:pPr>
         <w:spacing w:after="120"/>
-      </w:pPr>
-      <w:r>
+        <w:jc w:val="both"/>
+        <w:rPr>
+          <w:b/>
+          <w:bCs/>
+        </w:rPr>
+      </w:pPr>
+      <w:r>
+        <w:rPr>
+          <w:b/>
+          <w:bCs/>
+        </w:rPr>
         <w:t>Variables:</w:t>
       </w:r>
     </w:p>
@@ -143,12 +208,38 @@
         <w:pStyle w:val="ListParagraph"/>
         <w:numPr>
           <w:ilvl w:val="0"/>
-          <w:numId w:val="1"/>
+          <w:numId w:val="3"/>
         </w:numPr>
         <w:spacing w:after="60"/>
-      </w:pPr>
-      <w:r>
-        <w:t>species (categorical) — Adelie, Chinstrap, Gentoo</w:t>
+        <w:jc w:val="both"/>
+      </w:pPr>
+      <w:r>
+        <w:rPr>
+          <w:b/>
+          <w:bCs/>
+        </w:rPr>
+        <w:t>species (categorical)</w:t>
+      </w:r>
+      <w:r>
+        <w:t xml:space="preserve"> </w:t>
+      </w:r>
+      <w:r>
+        <w:t>–</w:t>
+      </w:r>
+      <w:r>
+        <w:t xml:space="preserve"> </w:t>
+      </w:r>
+      <w:r>
+        <w:t>[</w:t>
+      </w:r>
+      <w:r>
+        <w:t>Adelie, Chinstrap, Gentoo</w:t>
+      </w:r>
+      <w:r>
+        <w:t xml:space="preserve">] | </w:t>
+      </w:r>
+      <w:r>
+        <w:t>The main grouping factor in the dataset, and the strongest source of variation in every numeric measurement. 152 Adelie (44.2%), 124 Gentoo (36.0%), 68 Chinstrap (19.8%); no missing values.</w:t>
       </w:r>
     </w:p>
     <w:p>
@@ -156,12 +247,38 @@
         <w:pStyle w:val="ListParagraph"/>
         <w:numPr>
           <w:ilvl w:val="0"/>
-          <w:numId w:val="1"/>
+          <w:numId w:val="3"/>
         </w:numPr>
         <w:spacing w:after="60"/>
-      </w:pPr>
-      <w:r>
-        <w:t>island (categorical) — Biscoe, Dream, Torgersen</w:t>
+        <w:jc w:val="both"/>
+      </w:pPr>
+      <w:r>
+        <w:rPr>
+          <w:b/>
+          <w:bCs/>
+        </w:rPr>
+        <w:t>island (categorical)</w:t>
+      </w:r>
+      <w:r>
+        <w:t xml:space="preserve"> </w:t>
+      </w:r>
+      <w:r>
+        <w:t>-</w:t>
+      </w:r>
+      <w:r>
+        <w:t xml:space="preserve"> </w:t>
+      </w:r>
+      <w:r>
+        <w:t>[</w:t>
+      </w:r>
+      <w:r>
+        <w:t>Biscoe, Dream, Torgersen</w:t>
+      </w:r>
+      <w:r>
+        <w:t xml:space="preserve">] | </w:t>
+      </w:r>
+      <w:r>
+        <w:t>The island in the Palmer Archipelago where the penguin was sampled. 168 Biscoe (48.8%), 124 Dream (36.0%), 52 Torgersen (15.1%). Not an independent factor — each island hosts a different, non-overlapping subset of species, so it behaves largely as a proxy for species rather than a separate geographic effect.</w:t>
       </w:r>
     </w:p>
     <w:p>
@@ -169,12 +286,38 @@
         <w:pStyle w:val="ListParagraph"/>
         <w:numPr>
           <w:ilvl w:val="0"/>
-          <w:numId w:val="1"/>
+          <w:numId w:val="3"/>
         </w:numPr>
         <w:spacing w:after="60"/>
-      </w:pPr>
-      <w:r>
-        <w:t>sex (categorical) — Male, Female (11 missing values)</w:t>
+        <w:jc w:val="both"/>
+      </w:pPr>
+      <w:r>
+        <w:rPr>
+          <w:b/>
+          <w:bCs/>
+        </w:rPr>
+        <w:t>sex (categorical)</w:t>
+      </w:r>
+      <w:r>
+        <w:t xml:space="preserve"> </w:t>
+      </w:r>
+      <w:r>
+        <w:t>-</w:t>
+      </w:r>
+      <w:r>
+        <w:t xml:space="preserve"> </w:t>
+      </w:r>
+      <w:r>
+        <w:t>[</w:t>
+      </w:r>
+      <w:r>
+        <w:t>Male, Female</w:t>
+      </w:r>
+      <w:r>
+        <w:t xml:space="preserve">] | </w:t>
+      </w:r>
+      <w:r>
+        <w:t>Roughly balanced: 168 male (50.5%), 165 female (49.5%), with 11 records missing sex. Within every species, males average heavier body mass than females.</w:t>
       </w:r>
     </w:p>
     <w:p>
@@ -182,17 +325,43 @@
         <w:pStyle w:val="ListParagraph"/>
         <w:numPr>
           <w:ilvl w:val="0"/>
-          <w:numId w:val="1"/>
+          <w:numId w:val="3"/>
         </w:numPr>
         <w:spacing w:after="60"/>
-      </w:pPr>
-      <w:proofErr w:type="spellStart"/>
-      <w:r>
-        <w:t>bill_length_mm</w:t>
-      </w:r>
-      <w:proofErr w:type="spellEnd"/>
-      <w:r>
-        <w:t xml:space="preserve"> (numeric)</w:t>
+        <w:jc w:val="both"/>
+        <w:rPr>
+          <w:b/>
+          <w:bCs/>
+        </w:rPr>
+      </w:pPr>
+      <w:r>
+        <w:rPr>
+          <w:b/>
+          <w:bCs/>
+        </w:rPr>
+        <w:t>bill_length_mm (numeric)</w:t>
+      </w:r>
+      <w:r>
+        <w:rPr>
+          <w:b/>
+          <w:bCs/>
+        </w:rPr>
+        <w:t xml:space="preserve"> - </w:t>
+      </w:r>
+      <w:r>
+        <w:t xml:space="preserve">Length of the penguin's bill, in </w:t>
+      </w:r>
+      <w:r>
+        <w:t>millimeters</w:t>
+      </w:r>
+      <w:r>
+        <w:t xml:space="preserve">. Mean 43.92 mm, range 32.1–59.6 mm. Adelie has the shortest bills (~38.8 mm); Chinstrap and Gentoo are longer and </w:t>
+      </w:r>
+      <w:r>
+        <w:t>similar in length</w:t>
+      </w:r>
+      <w:r>
+        <w:t xml:space="preserve"> (~47.5–48.8 mm).</w:t>
       </w:r>
     </w:p>
     <w:p>
@@ -200,17 +369,37 @@
         <w:pStyle w:val="ListParagraph"/>
         <w:numPr>
           <w:ilvl w:val="0"/>
-          <w:numId w:val="1"/>
+          <w:numId w:val="3"/>
         </w:numPr>
         <w:spacing w:after="60"/>
-      </w:pPr>
-      <w:proofErr w:type="spellStart"/>
-      <w:r>
-        <w:t>bill_depth_mm</w:t>
-      </w:r>
-      <w:proofErr w:type="spellEnd"/>
-      <w:r>
-        <w:t xml:space="preserve"> (numeric)</w:t>
+        <w:jc w:val="both"/>
+        <w:rPr>
+          <w:b/>
+          <w:bCs/>
+        </w:rPr>
+      </w:pPr>
+      <w:r>
+        <w:rPr>
+          <w:b/>
+          <w:bCs/>
+        </w:rPr>
+        <w:t>bill_depth_mm (numeric)</w:t>
+      </w:r>
+      <w:r>
+        <w:rPr>
+          <w:b/>
+          <w:bCs/>
+        </w:rPr>
+        <w:t xml:space="preserve"> - </w:t>
+      </w:r>
+      <w:r>
+        <w:t xml:space="preserve">Depth (vertical thickness) of the bill, in </w:t>
+      </w:r>
+      <w:r>
+        <w:t>millimeters</w:t>
+      </w:r>
+      <w:r>
+        <w:t>. Mean 17.15 mm, range 13.1–21.5 mm. Gentoo stands apart with a notably shallower bill (~15.0 mm) than Adelie and Chinstrap (~18.4 mm each)</w:t>
       </w:r>
     </w:p>
     <w:p>
@@ -218,17 +407,36 @@
         <w:pStyle w:val="ListParagraph"/>
         <w:numPr>
           <w:ilvl w:val="0"/>
-          <w:numId w:val="1"/>
+          <w:numId w:val="3"/>
         </w:numPr>
         <w:spacing w:after="60"/>
-      </w:pPr>
-      <w:proofErr w:type="spellStart"/>
-      <w:r>
-        <w:t>flipper_length_mm</w:t>
-      </w:r>
-      <w:proofErr w:type="spellEnd"/>
-      <w:r>
-        <w:t xml:space="preserve"> (numeric)</w:t>
+        <w:jc w:val="both"/>
+      </w:pPr>
+      <w:r>
+        <w:rPr>
+          <w:b/>
+          <w:bCs/>
+        </w:rPr>
+        <w:t>flipper_length_mm (numeric)</w:t>
+      </w:r>
+      <w:r>
+        <w:rPr>
+          <w:b/>
+          <w:bCs/>
+        </w:rPr>
+        <w:t xml:space="preserve"> - </w:t>
+      </w:r>
+      <w:r>
+        <w:t xml:space="preserve">Length of the flipper, in </w:t>
+      </w:r>
+      <w:r>
+        <w:t>millimeters</w:t>
+      </w:r>
+      <w:r>
+        <w:t>. Mean 200.92 mm, range 172–231 mm. Gentoo has markedly longer flippers (~217 mm) than Adelie (~190 mm) and Chinstrap (~196 mm), consistent with its larger overall body size</w:t>
+      </w:r>
+      <w:r>
+        <w:t>.</w:t>
       </w:r>
     </w:p>
     <w:p>
@@ -236,22 +444,37 @@
         <w:pStyle w:val="ListParagraph"/>
         <w:numPr>
           <w:ilvl w:val="0"/>
-          <w:numId w:val="1"/>
+          <w:numId w:val="3"/>
         </w:numPr>
         <w:spacing w:after="60"/>
-      </w:pPr>
-      <w:proofErr w:type="spellStart"/>
-      <w:r>
-        <w:t>body_mass_g</w:t>
-      </w:r>
-      <w:proofErr w:type="spellEnd"/>
-      <w:r>
-        <w:t xml:space="preserve"> (numeric)</w:t>
-      </w:r>
-    </w:p>
-    <w:p>
-      <w:pPr>
-        <w:spacing w:after="120"/>
+        <w:jc w:val="both"/>
+        <w:rPr>
+          <w:b/>
+          <w:bCs/>
+        </w:rPr>
+      </w:pPr>
+      <w:r>
+        <w:rPr>
+          <w:b/>
+          <w:bCs/>
+        </w:rPr>
+        <w:t>body_mass_g (numeric)</w:t>
+      </w:r>
+      <w:r>
+        <w:rPr>
+          <w:b/>
+          <w:bCs/>
+        </w:rPr>
+        <w:t xml:space="preserve"> - </w:t>
+      </w:r>
+      <w:r>
+        <w:t>Body mass, in grams. Mean 4201.75 g, range 2700–6300 g. Gentoo is substantially heavier (~5076 g on average) than Adelie (~3701 g) and Chinstrap (~3733 g); within each species, males are heavier than females.</w:t>
+      </w:r>
+    </w:p>
+    <w:p>
+      <w:pPr>
+        <w:spacing w:after="120"/>
+        <w:jc w:val="both"/>
       </w:pPr>
       <w:r>
         <w:t>Two rows were missing all four numeric measurements and were excluded from the numeric analysis, leaving 342 usable records. All categorical variables retain their full counts where relevant.</w:t>
@@ -261,9 +484,16 @@
       <w:pPr>
         <w:pStyle w:val="Heading1"/>
         <w:spacing w:before="280" w:after="140"/>
-      </w:pPr>
-      <w:r>
-        <w:t>3. Descriptive Statistics — Numeric Variables</w:t>
+        <w:jc w:val="both"/>
+      </w:pPr>
+      <w:r>
+        <w:t>3. Descriptive Statistics</w:t>
+      </w:r>
+      <w:r>
+        <w:t>:</w:t>
+      </w:r>
+      <w:r>
+        <w:t xml:space="preserve"> Numeric Variables</w:t>
       </w:r>
     </w:p>
     <w:tbl>
@@ -294,18 +524,15 @@
         <w:gridCol w:w="900"/>
       </w:tblGrid>
       <w:tr>
-        <w:tblPrEx>
-          <w:tblCellMar>
-            <w:top w:w="0" w:type="dxa"/>
-            <w:bottom w:w="0" w:type="dxa"/>
-          </w:tblCellMar>
-        </w:tblPrEx>
         <w:tc>
           <w:tcPr>
             <w:tcW w:w="2300" w:type="dxa"/>
             <w:shd w:val="clear" w:color="auto" w:fill="2F5C4B"/>
           </w:tcPr>
           <w:p>
+            <w:pPr>
+              <w:jc w:val="both"/>
+            </w:pPr>
             <w:r>
               <w:rPr>
                 <w:b/>
@@ -324,6 +551,9 @@
             <w:shd w:val="clear" w:color="auto" w:fill="2F5C4B"/>
           </w:tcPr>
           <w:p>
+            <w:pPr>
+              <w:jc w:val="both"/>
+            </w:pPr>
             <w:r>
               <w:rPr>
                 <w:b/>
@@ -342,6 +572,9 @@
             <w:shd w:val="clear" w:color="auto" w:fill="2F5C4B"/>
           </w:tcPr>
           <w:p>
+            <w:pPr>
+              <w:jc w:val="both"/>
+            </w:pPr>
             <w:r>
               <w:rPr>
                 <w:b/>
@@ -360,6 +593,9 @@
             <w:shd w:val="clear" w:color="auto" w:fill="2F5C4B"/>
           </w:tcPr>
           <w:p>
+            <w:pPr>
+              <w:jc w:val="both"/>
+            </w:pPr>
             <w:r>
               <w:rPr>
                 <w:b/>
@@ -378,6 +614,9 @@
             <w:shd w:val="clear" w:color="auto" w:fill="2F5C4B"/>
           </w:tcPr>
           <w:p>
+            <w:pPr>
+              <w:jc w:val="both"/>
+            </w:pPr>
             <w:r>
               <w:rPr>
                 <w:b/>
@@ -396,6 +635,9 @@
             <w:shd w:val="clear" w:color="auto" w:fill="2F5C4B"/>
           </w:tcPr>
           <w:p>
+            <w:pPr>
+              <w:jc w:val="both"/>
+            </w:pPr>
             <w:r>
               <w:rPr>
                 <w:b/>
@@ -414,6 +656,9 @@
             <w:shd w:val="clear" w:color="auto" w:fill="2F5C4B"/>
           </w:tcPr>
           <w:p>
+            <w:pPr>
+              <w:jc w:val="both"/>
+            </w:pPr>
             <w:r>
               <w:rPr>
                 <w:b/>
@@ -432,6 +677,9 @@
             <w:shd w:val="clear" w:color="auto" w:fill="2F5C4B"/>
           </w:tcPr>
           <w:p>
+            <w:pPr>
+              <w:jc w:val="both"/>
+            </w:pPr>
             <w:r>
               <w:rPr>
                 <w:b/>
@@ -446,17 +694,14 @@
         </w:tc>
       </w:tr>
       <w:tr>
-        <w:tblPrEx>
-          <w:tblCellMar>
-            <w:top w:w="0" w:type="dxa"/>
-            <w:bottom w:w="0" w:type="dxa"/>
-          </w:tblCellMar>
-        </w:tblPrEx>
         <w:tc>
           <w:tcPr>
             <w:tcW w:w="2300" w:type="dxa"/>
           </w:tcPr>
           <w:p>
+            <w:pPr>
+              <w:jc w:val="both"/>
+            </w:pPr>
             <w:r>
               <w:rPr>
                 <w:sz w:val="18"/>
@@ -471,6 +716,9 @@
             <w:tcW w:w="800" w:type="dxa"/>
           </w:tcPr>
           <w:p>
+            <w:pPr>
+              <w:jc w:val="both"/>
+            </w:pPr>
             <w:r>
               <w:rPr>
                 <w:sz w:val="18"/>
@@ -485,6 +733,9 @@
             <w:tcW w:w="1300" w:type="dxa"/>
           </w:tcPr>
           <w:p>
+            <w:pPr>
+              <w:jc w:val="both"/>
+            </w:pPr>
             <w:r>
               <w:rPr>
                 <w:sz w:val="18"/>
@@ -499,6 +750,9 @@
             <w:tcW w:w="1300" w:type="dxa"/>
           </w:tcPr>
           <w:p>
+            <w:pPr>
+              <w:jc w:val="both"/>
+            </w:pPr>
             <w:r>
               <w:rPr>
                 <w:sz w:val="18"/>
@@ -513,6 +767,9 @@
             <w:tcW w:w="1300" w:type="dxa"/>
           </w:tcPr>
           <w:p>
+            <w:pPr>
+              <w:jc w:val="both"/>
+            </w:pPr>
             <w:r>
               <w:rPr>
                 <w:sz w:val="18"/>
@@ -527,6 +784,9 @@
             <w:tcW w:w="1000" w:type="dxa"/>
           </w:tcPr>
           <w:p>
+            <w:pPr>
+              <w:jc w:val="both"/>
+            </w:pPr>
             <w:r>
               <w:rPr>
                 <w:sz w:val="18"/>
@@ -541,6 +801,9 @@
             <w:tcW w:w="1000" w:type="dxa"/>
           </w:tcPr>
           <w:p>
+            <w:pPr>
+              <w:jc w:val="both"/>
+            </w:pPr>
             <w:r>
               <w:rPr>
                 <w:sz w:val="18"/>
@@ -555,6 +818,9 @@
             <w:tcW w:w="900" w:type="dxa"/>
           </w:tcPr>
           <w:p>
+            <w:pPr>
+              <w:jc w:val="both"/>
+            </w:pPr>
             <w:r>
               <w:rPr>
                 <w:sz w:val="18"/>
@@ -566,18 +832,15 @@
         </w:tc>
       </w:tr>
       <w:tr>
-        <w:tblPrEx>
-          <w:tblCellMar>
-            <w:top w:w="0" w:type="dxa"/>
-            <w:bottom w:w="0" w:type="dxa"/>
-          </w:tblCellMar>
-        </w:tblPrEx>
         <w:tc>
           <w:tcPr>
             <w:tcW w:w="2300" w:type="dxa"/>
             <w:shd w:val="clear" w:color="auto" w:fill="F0F4F2"/>
           </w:tcPr>
           <w:p>
+            <w:pPr>
+              <w:jc w:val="both"/>
+            </w:pPr>
             <w:r>
               <w:rPr>
                 <w:sz w:val="18"/>
@@ -593,6 +856,9 @@
             <w:shd w:val="clear" w:color="auto" w:fill="F0F4F2"/>
           </w:tcPr>
           <w:p>
+            <w:pPr>
+              <w:jc w:val="both"/>
+            </w:pPr>
             <w:r>
               <w:rPr>
                 <w:sz w:val="18"/>
@@ -608,6 +874,9 @@
             <w:shd w:val="clear" w:color="auto" w:fill="F0F4F2"/>
           </w:tcPr>
           <w:p>
+            <w:pPr>
+              <w:jc w:val="both"/>
+            </w:pPr>
             <w:r>
               <w:rPr>
                 <w:sz w:val="18"/>
@@ -623,6 +892,9 @@
             <w:shd w:val="clear" w:color="auto" w:fill="F0F4F2"/>
           </w:tcPr>
           <w:p>
+            <w:pPr>
+              <w:jc w:val="both"/>
+            </w:pPr>
             <w:r>
               <w:rPr>
                 <w:sz w:val="18"/>
@@ -638,6 +910,9 @@
             <w:shd w:val="clear" w:color="auto" w:fill="F0F4F2"/>
           </w:tcPr>
           <w:p>
+            <w:pPr>
+              <w:jc w:val="both"/>
+            </w:pPr>
             <w:r>
               <w:rPr>
                 <w:sz w:val="18"/>
@@ -653,6 +928,9 @@
             <w:shd w:val="clear" w:color="auto" w:fill="F0F4F2"/>
           </w:tcPr>
           <w:p>
+            <w:pPr>
+              <w:jc w:val="both"/>
+            </w:pPr>
             <w:r>
               <w:rPr>
                 <w:sz w:val="18"/>
@@ -668,6 +946,9 @@
             <w:shd w:val="clear" w:color="auto" w:fill="F0F4F2"/>
           </w:tcPr>
           <w:p>
+            <w:pPr>
+              <w:jc w:val="both"/>
+            </w:pPr>
             <w:r>
               <w:rPr>
                 <w:sz w:val="18"/>
@@ -683,6 +964,9 @@
             <w:shd w:val="clear" w:color="auto" w:fill="F0F4F2"/>
           </w:tcPr>
           <w:p>
+            <w:pPr>
+              <w:jc w:val="both"/>
+            </w:pPr>
             <w:r>
               <w:rPr>
                 <w:sz w:val="18"/>
@@ -694,17 +978,14 @@
         </w:tc>
       </w:tr>
       <w:tr>
-        <w:tblPrEx>
-          <w:tblCellMar>
-            <w:top w:w="0" w:type="dxa"/>
-            <w:bottom w:w="0" w:type="dxa"/>
-          </w:tblCellMar>
-        </w:tblPrEx>
         <w:tc>
           <w:tcPr>
             <w:tcW w:w="2300" w:type="dxa"/>
           </w:tcPr>
           <w:p>
+            <w:pPr>
+              <w:jc w:val="both"/>
+            </w:pPr>
             <w:r>
               <w:rPr>
                 <w:sz w:val="18"/>
@@ -719,6 +1000,9 @@
             <w:tcW w:w="800" w:type="dxa"/>
           </w:tcPr>
           <w:p>
+            <w:pPr>
+              <w:jc w:val="both"/>
+            </w:pPr>
             <w:r>
               <w:rPr>
                 <w:sz w:val="18"/>
@@ -733,6 +1017,9 @@
             <w:tcW w:w="1300" w:type="dxa"/>
           </w:tcPr>
           <w:p>
+            <w:pPr>
+              <w:jc w:val="both"/>
+            </w:pPr>
             <w:r>
               <w:rPr>
                 <w:sz w:val="18"/>
@@ -747,6 +1034,9 @@
             <w:tcW w:w="1300" w:type="dxa"/>
           </w:tcPr>
           <w:p>
+            <w:pPr>
+              <w:jc w:val="both"/>
+            </w:pPr>
             <w:r>
               <w:rPr>
                 <w:sz w:val="18"/>
@@ -761,6 +1051,9 @@
             <w:tcW w:w="1300" w:type="dxa"/>
           </w:tcPr>
           <w:p>
+            <w:pPr>
+              <w:jc w:val="both"/>
+            </w:pPr>
             <w:r>
               <w:rPr>
                 <w:sz w:val="18"/>
@@ -775,6 +1068,9 @@
             <w:tcW w:w="1000" w:type="dxa"/>
           </w:tcPr>
           <w:p>
+            <w:pPr>
+              <w:jc w:val="both"/>
+            </w:pPr>
             <w:r>
               <w:rPr>
                 <w:sz w:val="18"/>
@@ -789,6 +1085,9 @@
             <w:tcW w:w="1000" w:type="dxa"/>
           </w:tcPr>
           <w:p>
+            <w:pPr>
+              <w:jc w:val="both"/>
+            </w:pPr>
             <w:r>
               <w:rPr>
                 <w:sz w:val="18"/>
@@ -803,6 +1102,9 @@
             <w:tcW w:w="900" w:type="dxa"/>
           </w:tcPr>
           <w:p>
+            <w:pPr>
+              <w:jc w:val="both"/>
+            </w:pPr>
             <w:r>
               <w:rPr>
                 <w:sz w:val="18"/>
@@ -814,18 +1116,15 @@
         </w:tc>
       </w:tr>
       <w:tr>
-        <w:tblPrEx>
-          <w:tblCellMar>
-            <w:top w:w="0" w:type="dxa"/>
-            <w:bottom w:w="0" w:type="dxa"/>
-          </w:tblCellMar>
-        </w:tblPrEx>
         <w:tc>
           <w:tcPr>
             <w:tcW w:w="2300" w:type="dxa"/>
             <w:shd w:val="clear" w:color="auto" w:fill="F0F4F2"/>
           </w:tcPr>
           <w:p>
+            <w:pPr>
+              <w:jc w:val="both"/>
+            </w:pPr>
             <w:r>
               <w:rPr>
                 <w:sz w:val="18"/>
@@ -841,6 +1140,9 @@
             <w:shd w:val="clear" w:color="auto" w:fill="F0F4F2"/>
           </w:tcPr>
           <w:p>
+            <w:pPr>
+              <w:jc w:val="both"/>
+            </w:pPr>
             <w:r>
               <w:rPr>
                 <w:sz w:val="18"/>
@@ -856,6 +1158,9 @@
             <w:shd w:val="clear" w:color="auto" w:fill="F0F4F2"/>
           </w:tcPr>
           <w:p>
+            <w:pPr>
+              <w:jc w:val="both"/>
+            </w:pPr>
             <w:r>
               <w:rPr>
                 <w:sz w:val="18"/>
@@ -871,6 +1176,9 @@
             <w:shd w:val="clear" w:color="auto" w:fill="F0F4F2"/>
           </w:tcPr>
           <w:p>
+            <w:pPr>
+              <w:jc w:val="both"/>
+            </w:pPr>
             <w:r>
               <w:rPr>
                 <w:sz w:val="18"/>
@@ -886,6 +1194,9 @@
             <w:shd w:val="clear" w:color="auto" w:fill="F0F4F2"/>
           </w:tcPr>
           <w:p>
+            <w:pPr>
+              <w:jc w:val="both"/>
+            </w:pPr>
             <w:r>
               <w:rPr>
                 <w:sz w:val="18"/>
@@ -901,6 +1212,9 @@
             <w:shd w:val="clear" w:color="auto" w:fill="F0F4F2"/>
           </w:tcPr>
           <w:p>
+            <w:pPr>
+              <w:jc w:val="both"/>
+            </w:pPr>
             <w:r>
               <w:rPr>
                 <w:sz w:val="18"/>
@@ -916,6 +1230,9 @@
             <w:shd w:val="clear" w:color="auto" w:fill="F0F4F2"/>
           </w:tcPr>
           <w:p>
+            <w:pPr>
+              <w:jc w:val="both"/>
+            </w:pPr>
             <w:r>
               <w:rPr>
                 <w:sz w:val="18"/>
@@ -931,6 +1248,9 @@
             <w:shd w:val="clear" w:color="auto" w:fill="F0F4F2"/>
           </w:tcPr>
           <w:p>
+            <w:pPr>
+              <w:jc w:val="both"/>
+            </w:pPr>
             <w:r>
               <w:rPr>
                 <w:sz w:val="18"/>
@@ -944,29 +1264,98 @@
     </w:tbl>
     <w:p>
       <w:pPr>
-        <w:spacing w:after="160"/>
-      </w:pPr>
-    </w:p>
-    <w:p>
-      <w:pPr>
-        <w:spacing w:after="120"/>
-      </w:pPr>
-      <w:r>
-        <w:t>All four numeric variables have skewness close to zero (between -0.14 and 0.47), indicating roughly symmetric distributions with a slight right-skew for body mass. Negative kurtosis values (around -0.7 to -1.0) indicate flatter-than-normal distributions — consistent with three distinct species creating multiple humps rather than one sharp peak, as seen in the histograms below.</w:t>
-      </w:r>
+        <w:spacing w:after="120"/>
+        <w:jc w:val="both"/>
+      </w:pPr>
+    </w:p>
+    <w:p>
+      <w:pPr>
+        <w:spacing w:after="120"/>
+        <w:jc w:val="both"/>
+      </w:pPr>
+      <w:r>
+        <w:t xml:space="preserve">All four numeric variables have skewness close to zero (between -0.14 and 0.47), indicating </w:t>
+      </w:r>
+      <w:r>
+        <w:t>rough</w:t>
+      </w:r>
+      <w:r>
+        <w:t xml:space="preserve"> symmetric distributions, with a slight right-skew in</w:t>
+      </w:r>
+      <w:r>
+        <w:t xml:space="preserve"> body mass. Negative kurtosis values (around -0.7 to -1.0) indicate flatter-than-normal distributions</w:t>
+      </w:r>
+      <w:r>
+        <w:t xml:space="preserve">, </w:t>
+      </w:r>
+      <w:r>
+        <w:t>consistent with three distinct species creating multiple humps rather than one sharp peak, as seen in the histograms below.</w:t>
+      </w:r>
+    </w:p>
+    <w:p>
+      <w:pPr>
+        <w:spacing w:after="120"/>
+        <w:jc w:val="both"/>
+      </w:pPr>
+    </w:p>
+    <w:p>
+      <w:pPr>
+        <w:spacing w:after="120"/>
+        <w:jc w:val="both"/>
+      </w:pPr>
+    </w:p>
+    <w:p>
+      <w:pPr>
+        <w:spacing w:after="120"/>
+        <w:jc w:val="both"/>
+      </w:pPr>
     </w:p>
     <w:p>
       <w:pPr>
         <w:pStyle w:val="Heading1"/>
         <w:spacing w:before="280" w:after="140"/>
-      </w:pPr>
-      <w:r>
-        <w:t>4. Descriptive Statistics — Categorical Variables</w:t>
-      </w:r>
+        <w:jc w:val="both"/>
+      </w:pPr>
+      <w:r>
+        <w:lastRenderedPageBreak/>
+        <w:t>4. Descriptive Statistics</w:t>
+      </w:r>
+      <w:r>
+        <w:t>:</w:t>
+      </w:r>
+      <w:r>
+        <w:t xml:space="preserve"> Categorical Variables</w:t>
+      </w:r>
+    </w:p>
+    <w:p>
+      <w:pPr>
+        <w:jc w:val="both"/>
+      </w:pPr>
+      <w:r>
+        <w:t>The dataset contains three categorical variables</w:t>
+      </w:r>
+      <w:r>
+        <w:t>,</w:t>
+      </w:r>
+      <w:r>
+        <w:t xml:space="preserve"> species, island, and sex</w:t>
+      </w:r>
+      <w:r>
+        <w:t>,</w:t>
+      </w:r>
+      <w:r>
+        <w:t xml:space="preserve"> each summarized below by frequency count and percentage of the total sample.</w:t>
+      </w:r>
+    </w:p>
+    <w:p>
+      <w:pPr>
+        <w:jc w:val="both"/>
+      </w:pPr>
     </w:p>
     <w:tbl>
       <w:tblPr>
         <w:tblW w:w="9000" w:type="dxa"/>
+        <w:jc w:val="center"/>
         <w:tblBorders>
           <w:top w:val="single" w:sz="4" w:space="0" w:color="auto"/>
           <w:left w:val="single" w:sz="4" w:space="0" w:color="auto"/>
@@ -987,18 +1376,18 @@
         <w:gridCol w:w="3000"/>
       </w:tblGrid>
       <w:tr>
-        <w:tblPrEx>
-          <w:tblCellMar>
-            <w:top w:w="0" w:type="dxa"/>
-            <w:bottom w:w="0" w:type="dxa"/>
-          </w:tblCellMar>
-        </w:tblPrEx>
+        <w:trPr>
+          <w:jc w:val="center"/>
+        </w:trPr>
         <w:tc>
           <w:tcPr>
             <w:tcW w:w="3000" w:type="dxa"/>
             <w:shd w:val="clear" w:color="auto" w:fill="2F5C4B"/>
           </w:tcPr>
           <w:p>
+            <w:pPr>
+              <w:jc w:val="both"/>
+            </w:pPr>
             <w:r>
               <w:rPr>
                 <w:b/>
@@ -1017,6 +1406,9 @@
             <w:shd w:val="clear" w:color="auto" w:fill="2F5C4B"/>
           </w:tcPr>
           <w:p>
+            <w:pPr>
+              <w:jc w:val="both"/>
+            </w:pPr>
             <w:r>
               <w:rPr>
                 <w:b/>
@@ -1035,6 +1427,9 @@
             <w:shd w:val="clear" w:color="auto" w:fill="2F5C4B"/>
           </w:tcPr>
           <w:p>
+            <w:pPr>
+              <w:jc w:val="both"/>
+            </w:pPr>
             <w:r>
               <w:rPr>
                 <w:b/>
@@ -1049,17 +1444,17 @@
         </w:tc>
       </w:tr>
       <w:tr>
-        <w:tblPrEx>
-          <w:tblCellMar>
-            <w:top w:w="0" w:type="dxa"/>
-            <w:bottom w:w="0" w:type="dxa"/>
-          </w:tblCellMar>
-        </w:tblPrEx>
+        <w:trPr>
+          <w:jc w:val="center"/>
+        </w:trPr>
         <w:tc>
           <w:tcPr>
             <w:tcW w:w="3000" w:type="dxa"/>
           </w:tcPr>
           <w:p>
+            <w:pPr>
+              <w:jc w:val="both"/>
+            </w:pPr>
             <w:r>
               <w:rPr>
                 <w:sz w:val="18"/>
@@ -1074,6 +1469,9 @@
             <w:tcW w:w="3000" w:type="dxa"/>
           </w:tcPr>
           <w:p>
+            <w:pPr>
+              <w:jc w:val="both"/>
+            </w:pPr>
             <w:r>
               <w:rPr>
                 <w:sz w:val="18"/>
@@ -1088,6 +1486,9 @@
             <w:tcW w:w="3000" w:type="dxa"/>
           </w:tcPr>
           <w:p>
+            <w:pPr>
+              <w:jc w:val="both"/>
+            </w:pPr>
             <w:r>
               <w:rPr>
                 <w:sz w:val="18"/>
@@ -1099,18 +1500,18 @@
         </w:tc>
       </w:tr>
       <w:tr>
-        <w:tblPrEx>
-          <w:tblCellMar>
-            <w:top w:w="0" w:type="dxa"/>
-            <w:bottom w:w="0" w:type="dxa"/>
-          </w:tblCellMar>
-        </w:tblPrEx>
+        <w:trPr>
+          <w:jc w:val="center"/>
+        </w:trPr>
         <w:tc>
           <w:tcPr>
             <w:tcW w:w="3000" w:type="dxa"/>
             <w:shd w:val="clear" w:color="auto" w:fill="F0F4F2"/>
           </w:tcPr>
           <w:p>
+            <w:pPr>
+              <w:jc w:val="both"/>
+            </w:pPr>
             <w:r>
               <w:rPr>
                 <w:sz w:val="18"/>
@@ -1126,6 +1527,9 @@
             <w:shd w:val="clear" w:color="auto" w:fill="F0F4F2"/>
           </w:tcPr>
           <w:p>
+            <w:pPr>
+              <w:jc w:val="both"/>
+            </w:pPr>
             <w:r>
               <w:rPr>
                 <w:sz w:val="18"/>
@@ -1141,6 +1545,9 @@
             <w:shd w:val="clear" w:color="auto" w:fill="F0F4F2"/>
           </w:tcPr>
           <w:p>
+            <w:pPr>
+              <w:jc w:val="both"/>
+            </w:pPr>
             <w:r>
               <w:rPr>
                 <w:sz w:val="18"/>
@@ -1152,17 +1559,17 @@
         </w:tc>
       </w:tr>
       <w:tr>
-        <w:tblPrEx>
-          <w:tblCellMar>
-            <w:top w:w="0" w:type="dxa"/>
-            <w:bottom w:w="0" w:type="dxa"/>
-          </w:tblCellMar>
-        </w:tblPrEx>
+        <w:trPr>
+          <w:jc w:val="center"/>
+        </w:trPr>
         <w:tc>
           <w:tcPr>
             <w:tcW w:w="3000" w:type="dxa"/>
           </w:tcPr>
           <w:p>
+            <w:pPr>
+              <w:jc w:val="both"/>
+            </w:pPr>
             <w:r>
               <w:rPr>
                 <w:sz w:val="18"/>
@@ -1177,6 +1584,9 @@
             <w:tcW w:w="3000" w:type="dxa"/>
           </w:tcPr>
           <w:p>
+            <w:pPr>
+              <w:jc w:val="both"/>
+            </w:pPr>
             <w:r>
               <w:rPr>
                 <w:sz w:val="18"/>
@@ -1191,6 +1601,9 @@
             <w:tcW w:w="3000" w:type="dxa"/>
           </w:tcPr>
           <w:p>
+            <w:pPr>
+              <w:jc w:val="both"/>
+            </w:pPr>
             <w:r>
               <w:rPr>
                 <w:sz w:val="18"/>
@@ -1205,11 +1618,34 @@
     <w:p>
       <w:pPr>
         <w:spacing w:after="120"/>
+        <w:jc w:val="both"/>
+      </w:pPr>
+    </w:p>
+    <w:p>
+      <w:pPr>
+        <w:spacing w:after="120"/>
+        <w:jc w:val="both"/>
+      </w:pPr>
+      <w:r>
+        <w:t xml:space="preserve">Species </w:t>
+      </w:r>
+      <w:r>
+        <w:t>are</w:t>
+      </w:r>
+      <w:r>
+        <w:t xml:space="preserve"> the most unevenly distributed of the three: Adelie is the most common (152 birds, 44.2%), followed by Gentoo (124, 36.0%) and Chinstrap (68, 19.8%). This imbalance is worth keeping in mind for later comparisons, since group means based on smaller categories (like Chinstrap) rest on fewer observations and carry more sampling variability.</w:t>
+      </w:r>
+    </w:p>
+    <w:p>
+      <w:pPr>
+        <w:spacing w:after="120"/>
+        <w:jc w:val="both"/>
       </w:pPr>
     </w:p>
     <w:tbl>
       <w:tblPr>
         <w:tblW w:w="9000" w:type="dxa"/>
+        <w:jc w:val="center"/>
         <w:tblBorders>
           <w:top w:val="single" w:sz="4" w:space="0" w:color="auto"/>
           <w:left w:val="single" w:sz="4" w:space="0" w:color="auto"/>
@@ -1230,18 +1666,18 @@
         <w:gridCol w:w="3000"/>
       </w:tblGrid>
       <w:tr>
-        <w:tblPrEx>
-          <w:tblCellMar>
-            <w:top w:w="0" w:type="dxa"/>
-            <w:bottom w:w="0" w:type="dxa"/>
-          </w:tblCellMar>
-        </w:tblPrEx>
+        <w:trPr>
+          <w:jc w:val="center"/>
+        </w:trPr>
         <w:tc>
           <w:tcPr>
             <w:tcW w:w="3000" w:type="dxa"/>
             <w:shd w:val="clear" w:color="auto" w:fill="2F5C4B"/>
           </w:tcPr>
           <w:p>
+            <w:pPr>
+              <w:jc w:val="both"/>
+            </w:pPr>
             <w:r>
               <w:rPr>
                 <w:b/>
@@ -1260,6 +1696,9 @@
             <w:shd w:val="clear" w:color="auto" w:fill="2F5C4B"/>
           </w:tcPr>
           <w:p>
+            <w:pPr>
+              <w:jc w:val="both"/>
+            </w:pPr>
             <w:r>
               <w:rPr>
                 <w:b/>
@@ -1278,6 +1717,9 @@
             <w:shd w:val="clear" w:color="auto" w:fill="2F5C4B"/>
           </w:tcPr>
           <w:p>
+            <w:pPr>
+              <w:jc w:val="both"/>
+            </w:pPr>
             <w:r>
               <w:rPr>
                 <w:b/>
@@ -1292,17 +1734,17 @@
         </w:tc>
       </w:tr>
       <w:tr>
-        <w:tblPrEx>
-          <w:tblCellMar>
-            <w:top w:w="0" w:type="dxa"/>
-            <w:bottom w:w="0" w:type="dxa"/>
-          </w:tblCellMar>
-        </w:tblPrEx>
+        <w:trPr>
+          <w:jc w:val="center"/>
+        </w:trPr>
         <w:tc>
           <w:tcPr>
             <w:tcW w:w="3000" w:type="dxa"/>
           </w:tcPr>
           <w:p>
+            <w:pPr>
+              <w:jc w:val="both"/>
+            </w:pPr>
             <w:r>
               <w:rPr>
                 <w:sz w:val="18"/>
@@ -1317,6 +1759,9 @@
             <w:tcW w:w="3000" w:type="dxa"/>
           </w:tcPr>
           <w:p>
+            <w:pPr>
+              <w:jc w:val="both"/>
+            </w:pPr>
             <w:r>
               <w:rPr>
                 <w:sz w:val="18"/>
@@ -1331,6 +1776,9 @@
             <w:tcW w:w="3000" w:type="dxa"/>
           </w:tcPr>
           <w:p>
+            <w:pPr>
+              <w:jc w:val="both"/>
+            </w:pPr>
             <w:r>
               <w:rPr>
                 <w:sz w:val="18"/>
@@ -1342,18 +1790,18 @@
         </w:tc>
       </w:tr>
       <w:tr>
-        <w:tblPrEx>
-          <w:tblCellMar>
-            <w:top w:w="0" w:type="dxa"/>
-            <w:bottom w:w="0" w:type="dxa"/>
-          </w:tblCellMar>
-        </w:tblPrEx>
+        <w:trPr>
+          <w:jc w:val="center"/>
+        </w:trPr>
         <w:tc>
           <w:tcPr>
             <w:tcW w:w="3000" w:type="dxa"/>
             <w:shd w:val="clear" w:color="auto" w:fill="F0F4F2"/>
           </w:tcPr>
           <w:p>
+            <w:pPr>
+              <w:jc w:val="both"/>
+            </w:pPr>
             <w:r>
               <w:rPr>
                 <w:sz w:val="18"/>
@@ -1369,6 +1817,9 @@
             <w:shd w:val="clear" w:color="auto" w:fill="F0F4F2"/>
           </w:tcPr>
           <w:p>
+            <w:pPr>
+              <w:jc w:val="both"/>
+            </w:pPr>
             <w:r>
               <w:rPr>
                 <w:sz w:val="18"/>
@@ -1384,6 +1835,9 @@
             <w:shd w:val="clear" w:color="auto" w:fill="F0F4F2"/>
           </w:tcPr>
           <w:p>
+            <w:pPr>
+              <w:jc w:val="both"/>
+            </w:pPr>
             <w:r>
               <w:rPr>
                 <w:sz w:val="18"/>
@@ -1395,17 +1849,17 @@
         </w:tc>
       </w:tr>
       <w:tr>
-        <w:tblPrEx>
-          <w:tblCellMar>
-            <w:top w:w="0" w:type="dxa"/>
-            <w:bottom w:w="0" w:type="dxa"/>
-          </w:tblCellMar>
-        </w:tblPrEx>
+        <w:trPr>
+          <w:jc w:val="center"/>
+        </w:trPr>
         <w:tc>
           <w:tcPr>
             <w:tcW w:w="3000" w:type="dxa"/>
           </w:tcPr>
           <w:p>
+            <w:pPr>
+              <w:jc w:val="both"/>
+            </w:pPr>
             <w:r>
               <w:rPr>
                 <w:sz w:val="18"/>
@@ -1420,6 +1874,9 @@
             <w:tcW w:w="3000" w:type="dxa"/>
           </w:tcPr>
           <w:p>
+            <w:pPr>
+              <w:jc w:val="both"/>
+            </w:pPr>
             <w:r>
               <w:rPr>
                 <w:sz w:val="18"/>
@@ -1434,6 +1891,9 @@
             <w:tcW w:w="3000" w:type="dxa"/>
           </w:tcPr>
           <w:p>
+            <w:pPr>
+              <w:jc w:val="both"/>
+            </w:pPr>
             <w:r>
               <w:rPr>
                 <w:sz w:val="18"/>
@@ -1448,11 +1908,49 @@
     <w:p>
       <w:pPr>
         <w:spacing w:after="120"/>
+        <w:jc w:val="both"/>
+      </w:pPr>
+    </w:p>
+    <w:p>
+      <w:pPr>
+        <w:spacing w:after="120"/>
+        <w:jc w:val="both"/>
+      </w:pPr>
+      <w:r>
+        <w:t xml:space="preserve">Island shows a similar pattern: Biscoe accounts for the largest share of samples (168, 48.8%), followed by Dream (124, 36.0%) and Torgersen (52, 15.1%). As noted earlier, island isn't an independent </w:t>
+      </w:r>
+      <w:r>
+        <w:t>group</w:t>
+      </w:r>
+      <w:r>
+        <w:t>. E</w:t>
+      </w:r>
+      <w:r>
+        <w:t>ach island supports only a subset of species</w:t>
+      </w:r>
+      <w:r>
+        <w:t xml:space="preserve">. </w:t>
+      </w:r>
+      <w:r>
+        <w:t>S</w:t>
+      </w:r>
+      <w:r>
+        <w:t>o,</w:t>
+      </w:r>
+      <w:r>
+        <w:t xml:space="preserve"> this distribution is really a reflection of where each species happens to have been sampled, not a separate geographic pattern.</w:t>
+      </w:r>
+    </w:p>
+    <w:p>
+      <w:pPr>
+        <w:spacing w:after="120"/>
+        <w:jc w:val="both"/>
       </w:pPr>
     </w:p>
     <w:tbl>
       <w:tblPr>
         <w:tblW w:w="9000" w:type="dxa"/>
+        <w:jc w:val="center"/>
         <w:tblBorders>
           <w:top w:val="single" w:sz="4" w:space="0" w:color="auto"/>
           <w:left w:val="single" w:sz="4" w:space="0" w:color="auto"/>
@@ -1473,18 +1971,18 @@
         <w:gridCol w:w="3000"/>
       </w:tblGrid>
       <w:tr>
-        <w:tblPrEx>
-          <w:tblCellMar>
-            <w:top w:w="0" w:type="dxa"/>
-            <w:bottom w:w="0" w:type="dxa"/>
-          </w:tblCellMar>
-        </w:tblPrEx>
+        <w:trPr>
+          <w:jc w:val="center"/>
+        </w:trPr>
         <w:tc>
           <w:tcPr>
             <w:tcW w:w="3000" w:type="dxa"/>
             <w:shd w:val="clear" w:color="auto" w:fill="2F5C4B"/>
           </w:tcPr>
           <w:p>
+            <w:pPr>
+              <w:jc w:val="both"/>
+            </w:pPr>
             <w:r>
               <w:rPr>
                 <w:b/>
@@ -1503,6 +2001,9 @@
             <w:shd w:val="clear" w:color="auto" w:fill="2F5C4B"/>
           </w:tcPr>
           <w:p>
+            <w:pPr>
+              <w:jc w:val="both"/>
+            </w:pPr>
             <w:r>
               <w:rPr>
                 <w:b/>
@@ -1521,6 +2022,9 @@
             <w:shd w:val="clear" w:color="auto" w:fill="2F5C4B"/>
           </w:tcPr>
           <w:p>
+            <w:pPr>
+              <w:jc w:val="both"/>
+            </w:pPr>
             <w:r>
               <w:rPr>
                 <w:b/>
@@ -1535,12 +2039,9 @@
         </w:tc>
       </w:tr>
       <w:tr>
-        <w:tblPrEx>
-          <w:tblCellMar>
-            <w:top w:w="0" w:type="dxa"/>
-            <w:bottom w:w="0" w:type="dxa"/>
-          </w:tblCellMar>
-        </w:tblPrEx>
+        <w:trPr>
+          <w:jc w:val="center"/>
+        </w:trPr>
         <w:tc>
           <w:tcPr>
             <w:tcW w:w="3000" w:type="dxa"/>
@@ -1560,6 +2061,9 @@
             <w:tcW w:w="3000" w:type="dxa"/>
           </w:tcPr>
           <w:p>
+            <w:pPr>
+              <w:jc w:val="both"/>
+            </w:pPr>
             <w:r>
               <w:rPr>
                 <w:sz w:val="18"/>
@@ -1574,6 +2078,9 @@
             <w:tcW w:w="3000" w:type="dxa"/>
           </w:tcPr>
           <w:p>
+            <w:pPr>
+              <w:jc w:val="both"/>
+            </w:pPr>
             <w:r>
               <w:rPr>
                 <w:sz w:val="18"/>
@@ -1585,18 +2092,18 @@
         </w:tc>
       </w:tr>
       <w:tr>
-        <w:tblPrEx>
-          <w:tblCellMar>
-            <w:top w:w="0" w:type="dxa"/>
-            <w:bottom w:w="0" w:type="dxa"/>
-          </w:tblCellMar>
-        </w:tblPrEx>
+        <w:trPr>
+          <w:jc w:val="center"/>
+        </w:trPr>
         <w:tc>
           <w:tcPr>
             <w:tcW w:w="3000" w:type="dxa"/>
             <w:shd w:val="clear" w:color="auto" w:fill="F0F4F2"/>
           </w:tcPr>
           <w:p>
+            <w:pPr>
+              <w:jc w:val="both"/>
+            </w:pPr>
             <w:r>
               <w:rPr>
                 <w:sz w:val="18"/>
@@ -1612,6 +2119,9 @@
             <w:shd w:val="clear" w:color="auto" w:fill="F0F4F2"/>
           </w:tcPr>
           <w:p>
+            <w:pPr>
+              <w:jc w:val="both"/>
+            </w:pPr>
             <w:r>
               <w:rPr>
                 <w:sz w:val="18"/>
@@ -1627,6 +2137,9 @@
             <w:shd w:val="clear" w:color="auto" w:fill="F0F4F2"/>
           </w:tcPr>
           <w:p>
+            <w:pPr>
+              <w:jc w:val="both"/>
+            </w:pPr>
             <w:r>
               <w:rPr>
                 <w:sz w:val="18"/>
@@ -1641,6 +2154,7 @@
     <w:p>
       <w:pPr>
         <w:spacing w:after="160"/>
+        <w:jc w:val="both"/>
       </w:pPr>
     </w:p>
     <w:p>
@@ -1652,93 +2166,11 @@
         <w:rPr>
           <w:noProof/>
         </w:rPr>
-        <w:lastRenderedPageBreak/>
         <w:drawing>
           <wp:inline distT="0" distB="0" distL="0" distR="0" wp14:anchorId="56C9907D" wp14:editId="56C9907E">
             <wp:extent cx="5905500" cy="2000250"/>
             <wp:effectExtent l="0" t="0" r="0" b="0"/>
             <wp:docPr id="1" name="Picture 1"/>
-            <wp:cNvGraphicFramePr>
-              <a:graphicFrameLocks xmlns:a="http://schemas.openxmlformats.org/drawingml/2006/main" noChangeAspect="1"/>
-            </wp:cNvGraphicFramePr>
-            <a:graphic xmlns:a="http://schemas.openxmlformats.org/drawingml/2006/main">
-              <a:graphicData uri="http://schemas.openxmlformats.org/drawingml/2006/picture">
-                <pic:pic xmlns:pic="http://schemas.openxmlformats.org/drawingml/2006/picture">
-                  <pic:nvPicPr>
-                    <pic:cNvPr id="0" name=""/>
-                    <pic:cNvPicPr>
-                      <a:picLocks noChangeAspect="1" noChangeArrowheads="1"/>
-                    </pic:cNvPicPr>
-                  </pic:nvPicPr>
-                  <pic:blipFill>
-                    <a:blip r:embed="rId7"/>
-                    <a:srcRect/>
-                    <a:stretch>
-                      <a:fillRect/>
-                    </a:stretch>
-                  </pic:blipFill>
-                  <pic:spPr bwMode="auto">
-                    <a:xfrm>
-                      <a:off x="0" y="0"/>
-                      <a:ext cx="5905500" cy="2000250"/>
-                    </a:xfrm>
-                    <a:prstGeom prst="rect">
-                      <a:avLst/>
-                    </a:prstGeom>
-                  </pic:spPr>
-                </pic:pic>
-              </a:graphicData>
-            </a:graphic>
-          </wp:inline>
-        </w:drawing>
-      </w:r>
-    </w:p>
-    <w:p>
-      <w:pPr>
-        <w:spacing w:after="240"/>
-        <w:jc w:val="center"/>
-      </w:pPr>
-      <w:r>
-        <w:rPr>
-          <w:i/>
-          <w:iCs/>
-          <w:sz w:val="18"/>
-          <w:szCs w:val="18"/>
-        </w:rPr>
-        <w:t>Figure 1. Counts of observations by species, island, and sex.</w:t>
-      </w:r>
-    </w:p>
-    <w:p>
-      <w:pPr>
-        <w:spacing w:after="120"/>
-      </w:pPr>
-      <w:r>
-        <w:t>Adelie is the most common species (44.2%), and Biscoe is the most-sampled island (48.8%). Sex is almost perfectly balanced (50.5% male vs. 49.5% female).</w:t>
-      </w:r>
-    </w:p>
-    <w:p>
-      <w:pPr>
-        <w:pStyle w:val="Heading1"/>
-        <w:spacing w:before="280" w:after="140"/>
-      </w:pPr>
-      <w:r>
-        <w:t>5. Distribution of Numeric Variables</w:t>
-      </w:r>
-    </w:p>
-    <w:p>
-      <w:pPr>
-        <w:spacing w:after="60"/>
-        <w:jc w:val="center"/>
-      </w:pPr>
-      <w:r>
-        <w:rPr>
-          <w:noProof/>
-        </w:rPr>
-        <w:drawing>
-          <wp:inline distT="0" distB="0" distL="0" distR="0" wp14:anchorId="56C9907F" wp14:editId="56C99080">
-            <wp:extent cx="5334000" cy="3857625"/>
-            <wp:effectExtent l="0" t="0" r="0" b="0"/>
-            <wp:docPr id="1650976680" name="Picture 1650976680"/>
             <wp:cNvGraphicFramePr>
               <a:graphicFrameLocks xmlns:a="http://schemas.openxmlformats.org/drawingml/2006/main" noChangeAspect="1"/>
             </wp:cNvGraphicFramePr>
@@ -1761,7 +2193,7 @@
                   <pic:spPr bwMode="auto">
                     <a:xfrm>
                       <a:off x="0" y="0"/>
-                      <a:ext cx="5334000" cy="3857625"/>
+                      <a:ext cx="5905500" cy="2000250"/>
                     </a:xfrm>
                     <a:prstGeom prst="rect">
                       <a:avLst/>
@@ -1786,50 +2218,88 @@
           <w:sz w:val="18"/>
           <w:szCs w:val="18"/>
         </w:rPr>
-        <w:t xml:space="preserve">Figure 2. Histograms of the four numeric variables, </w:t>
-      </w:r>
-      <w:r>
-        <w:rPr>
-          <w:i/>
-          <w:iCs/>
-          <w:sz w:val="18"/>
-          <w:szCs w:val="18"/>
-        </w:rPr>
-        <w:t>colored</w:t>
-      </w:r>
-      <w:r>
-        <w:rPr>
-          <w:i/>
-          <w:iCs/>
-          <w:sz w:val="18"/>
-          <w:szCs w:val="18"/>
-        </w:rPr>
-        <w:t xml:space="preserve"> by species.</w:t>
-      </w:r>
-    </w:p>
-    <w:p>
-      <w:pPr>
-        <w:spacing w:after="120"/>
-      </w:pPr>
-      <w:r>
-        <w:t>Each histogram reveals that the apparent single distribution is really a mixture of three species-specific sub-distributions. Bill depth and body mass show the clearest separation, with Gentoo penguins standing apart from Adelie and Chinstrap.</w:t>
+        <w:t>Figure 1. Counts of observations by species, island, and sex.</w:t>
+      </w:r>
+    </w:p>
+    <w:p>
+      <w:pPr>
+        <w:spacing w:after="120"/>
+        <w:jc w:val="both"/>
+      </w:pPr>
+      <w:r>
+        <w:t>Adelie is the most common species (44.2%), and Biscoe is the most-sampled island (48.8%). Sex is almost perfectly balanced (50.5% male vs. 49.5% female).</w:t>
+      </w:r>
+      <w:r>
+        <w:t xml:space="preserve"> </w:t>
+      </w:r>
+    </w:p>
+    <w:p>
+      <w:pPr>
+        <w:spacing w:after="120"/>
+        <w:jc w:val="both"/>
+      </w:pPr>
+    </w:p>
+    <w:p>
+      <w:pPr>
+        <w:spacing w:after="120"/>
+        <w:jc w:val="both"/>
+      </w:pPr>
+    </w:p>
+    <w:p>
+      <w:pPr>
+        <w:spacing w:after="120"/>
+        <w:jc w:val="both"/>
+      </w:pPr>
+    </w:p>
+    <w:p>
+      <w:pPr>
+        <w:spacing w:after="120"/>
+        <w:jc w:val="both"/>
+      </w:pPr>
+    </w:p>
+    <w:p>
+      <w:pPr>
+        <w:spacing w:after="120"/>
+        <w:jc w:val="both"/>
+      </w:pPr>
+    </w:p>
+    <w:p>
+      <w:pPr>
+        <w:spacing w:after="120"/>
+        <w:jc w:val="both"/>
+      </w:pPr>
+    </w:p>
+    <w:p>
+      <w:pPr>
+        <w:spacing w:after="120"/>
+        <w:jc w:val="both"/>
+      </w:pPr>
+    </w:p>
+    <w:p>
+      <w:pPr>
+        <w:pStyle w:val="Heading1"/>
+        <w:spacing w:before="280" w:after="140"/>
+        <w:jc w:val="both"/>
+      </w:pPr>
+      <w:r>
+        <w:lastRenderedPageBreak/>
+        <w:t>5. Distribution of Numeric Variables</w:t>
       </w:r>
     </w:p>
     <w:p>
       <w:pPr>
         <w:spacing w:after="60"/>
-        <w:jc w:val="center"/>
+        <w:jc w:val="both"/>
       </w:pPr>
       <w:r>
         <w:rPr>
           <w:noProof/>
         </w:rPr>
-        <w:lastRenderedPageBreak/>
         <w:drawing>
-          <wp:inline distT="0" distB="0" distL="0" distR="0" wp14:anchorId="56C99081" wp14:editId="56C99082">
-            <wp:extent cx="4000500" cy="3286125"/>
+          <wp:inline distT="0" distB="0" distL="0" distR="0" wp14:anchorId="56C9907F" wp14:editId="56C99080">
+            <wp:extent cx="5334000" cy="3857625"/>
             <wp:effectExtent l="0" t="0" r="0" b="0"/>
-            <wp:docPr id="483237519" name="Picture 483237519"/>
+            <wp:docPr id="1650976680" name="Picture 1650976680"/>
             <wp:cNvGraphicFramePr>
               <a:graphicFrameLocks xmlns:a="http://schemas.openxmlformats.org/drawingml/2006/main" noChangeAspect="1"/>
             </wp:cNvGraphicFramePr>
@@ -1852,7 +2322,7 @@
                   <pic:spPr bwMode="auto">
                     <a:xfrm>
                       <a:off x="0" y="0"/>
-                      <a:ext cx="4000500" cy="3286125"/>
+                      <a:ext cx="5334000" cy="3857625"/>
                     </a:xfrm>
                     <a:prstGeom prst="rect">
                       <a:avLst/>
@@ -1877,23 +2347,144 @@
           <w:sz w:val="18"/>
           <w:szCs w:val="18"/>
         </w:rPr>
-        <w:t>Figure 3. Correlation matrix of the numeric variables.</w:t>
-      </w:r>
-    </w:p>
-    <w:p>
-      <w:pPr>
-        <w:spacing w:after="120"/>
-      </w:pPr>
-      <w:r>
-        <w:t>Flipper length and body mass are strongly positively correlated (r ≈ 0.87), as expected for overall body size. Bill depth is negatively correlated with both flipper length (r ≈ -0.58) and body mass (r ≈ -0.47) — this is a between-species effect: Gentoo penguins have long flippers, high body mass, and shallow bills, while Adelie/Chinstrap show the opposite pattern.</w:t>
+        <w:t xml:space="preserve">Figure 2. Histograms of the four numeric variables, </w:t>
+      </w:r>
+      <w:r>
+        <w:rPr>
+          <w:i/>
+          <w:iCs/>
+          <w:sz w:val="18"/>
+          <w:szCs w:val="18"/>
+        </w:rPr>
+        <w:t>colored</w:t>
+      </w:r>
+      <w:r>
+        <w:rPr>
+          <w:i/>
+          <w:iCs/>
+          <w:sz w:val="18"/>
+          <w:szCs w:val="18"/>
+        </w:rPr>
+        <w:t xml:space="preserve"> by species.</w:t>
+      </w:r>
+    </w:p>
+    <w:p>
+      <w:pPr>
+        <w:spacing w:after="120"/>
+        <w:jc w:val="both"/>
+      </w:pPr>
+      <w:r>
+        <w:t>Each histogram reveals that the apparent single distribution is really a mixture of three species-specific sub-distributions. Bill depth and body mass show the clearest separation, with Gentoo penguins standing apart from Adelie and Chinstrap.</w:t>
+      </w:r>
+    </w:p>
+    <w:p>
+      <w:pPr>
+        <w:spacing w:after="60"/>
+        <w:jc w:val="center"/>
+      </w:pPr>
+      <w:r>
+        <w:rPr>
+          <w:noProof/>
+        </w:rPr>
+        <w:drawing>
+          <wp:inline distT="0" distB="0" distL="0" distR="0" wp14:anchorId="56C99081" wp14:editId="46F57DB9">
+            <wp:extent cx="3550124" cy="2916173"/>
+            <wp:effectExtent l="0" t="0" r="0" b="0"/>
+            <wp:docPr id="483237519" name="Picture 483237519"/>
+            <wp:cNvGraphicFramePr>
+              <a:graphicFrameLocks xmlns:a="http://schemas.openxmlformats.org/drawingml/2006/main" noChangeAspect="1"/>
+            </wp:cNvGraphicFramePr>
+            <a:graphic xmlns:a="http://schemas.openxmlformats.org/drawingml/2006/main">
+              <a:graphicData uri="http://schemas.openxmlformats.org/drawingml/2006/picture">
+                <pic:pic xmlns:pic="http://schemas.openxmlformats.org/drawingml/2006/picture">
+                  <pic:nvPicPr>
+                    <pic:cNvPr id="0" name=""/>
+                    <pic:cNvPicPr>
+                      <a:picLocks noChangeAspect="1" noChangeArrowheads="1"/>
+                    </pic:cNvPicPr>
+                  </pic:nvPicPr>
+                  <pic:blipFill>
+                    <a:blip r:embed="rId10"/>
+                    <a:srcRect/>
+                    <a:stretch>
+                      <a:fillRect/>
+                    </a:stretch>
+                  </pic:blipFill>
+                  <pic:spPr bwMode="auto">
+                    <a:xfrm>
+                      <a:off x="0" y="0"/>
+                      <a:ext cx="3560883" cy="2925011"/>
+                    </a:xfrm>
+                    <a:prstGeom prst="rect">
+                      <a:avLst/>
+                    </a:prstGeom>
+                  </pic:spPr>
+                </pic:pic>
+              </a:graphicData>
+            </a:graphic>
+          </wp:inline>
+        </w:drawing>
+      </w:r>
+    </w:p>
+    <w:p>
+      <w:pPr>
+        <w:spacing w:after="240"/>
+        <w:jc w:val="center"/>
+      </w:pPr>
+      <w:r>
+        <w:rPr>
+          <w:i/>
+          <w:iCs/>
+          <w:sz w:val="18"/>
+          <w:szCs w:val="18"/>
+        </w:rPr>
+        <w:t xml:space="preserve">Figure 3. Correlation matrix of </w:t>
+      </w:r>
+      <w:r>
+        <w:rPr>
+          <w:i/>
+          <w:iCs/>
+          <w:sz w:val="18"/>
+          <w:szCs w:val="18"/>
+        </w:rPr>
+        <w:t>numeric</w:t>
+      </w:r>
+      <w:r>
+        <w:rPr>
+          <w:i/>
+          <w:iCs/>
+          <w:sz w:val="18"/>
+          <w:szCs w:val="18"/>
+        </w:rPr>
+        <w:t xml:space="preserve"> variables.</w:t>
+      </w:r>
+    </w:p>
+    <w:p>
+      <w:pPr>
+        <w:spacing w:after="120"/>
+        <w:jc w:val="both"/>
+      </w:pPr>
+      <w:r>
+        <w:t>Flipper length and body mass are strongly positively correlated (r ≈ 0.87), as expected for overall body size. Bill depth is negatively correlated with both flipper length (r ≈ -0.58) and body mass (r ≈ -</w:t>
+      </w:r>
+      <w:r>
+        <w:t>0.47)</w:t>
+      </w:r>
+      <w:r>
+        <w:t>. T</w:t>
+      </w:r>
+      <w:r>
+        <w:t>his is a between-species effect: Gentoo penguins have long flippers, high body mass, and shallow bills, while Adelie/Chinstrap show the opposite pattern.</w:t>
       </w:r>
     </w:p>
     <w:p>
       <w:pPr>
         <w:pStyle w:val="Heading1"/>
         <w:spacing w:before="280" w:after="140"/>
-      </w:pPr>
-      <w:r>
+        <w:jc w:val="both"/>
+      </w:pPr>
+      <w:r>
+        <w:lastRenderedPageBreak/>
         <w:t>6. Behavior of Variables by Category</w:t>
       </w:r>
     </w:p>
@@ -1901,6 +2492,7 @@
       <w:pPr>
         <w:pStyle w:val="Heading2"/>
         <w:spacing w:before="280" w:after="140"/>
+        <w:jc w:val="both"/>
       </w:pPr>
       <w:r>
         <w:t>6.1 By Species</w:t>
@@ -1931,18 +2523,15 @@
         <w:gridCol w:w="1800"/>
       </w:tblGrid>
       <w:tr>
-        <w:tblPrEx>
-          <w:tblCellMar>
-            <w:top w:w="0" w:type="dxa"/>
-            <w:bottom w:w="0" w:type="dxa"/>
-          </w:tblCellMar>
-        </w:tblPrEx>
         <w:tc>
           <w:tcPr>
             <w:tcW w:w="1600" w:type="dxa"/>
             <w:shd w:val="clear" w:color="auto" w:fill="2F5C4B"/>
           </w:tcPr>
           <w:p>
+            <w:pPr>
+              <w:jc w:val="both"/>
+            </w:pPr>
             <w:r>
               <w:rPr>
                 <w:b/>
@@ -1961,6 +2550,9 @@
             <w:shd w:val="clear" w:color="auto" w:fill="2F5C4B"/>
           </w:tcPr>
           <w:p>
+            <w:pPr>
+              <w:jc w:val="both"/>
+            </w:pPr>
             <w:r>
               <w:rPr>
                 <w:b/>
@@ -1979,6 +2571,9 @@
             <w:shd w:val="clear" w:color="auto" w:fill="2F5C4B"/>
           </w:tcPr>
           <w:p>
+            <w:pPr>
+              <w:jc w:val="both"/>
+            </w:pPr>
             <w:r>
               <w:rPr>
                 <w:b/>
@@ -1997,6 +2592,9 @@
             <w:shd w:val="clear" w:color="auto" w:fill="2F5C4B"/>
           </w:tcPr>
           <w:p>
+            <w:pPr>
+              <w:jc w:val="both"/>
+            </w:pPr>
             <w:r>
               <w:rPr>
                 <w:b/>
@@ -2015,6 +2613,9 @@
             <w:shd w:val="clear" w:color="auto" w:fill="2F5C4B"/>
           </w:tcPr>
           <w:p>
+            <w:pPr>
+              <w:jc w:val="both"/>
+            </w:pPr>
             <w:r>
               <w:rPr>
                 <w:b/>
@@ -2029,17 +2630,14 @@
         </w:tc>
       </w:tr>
       <w:tr>
-        <w:tblPrEx>
-          <w:tblCellMar>
-            <w:top w:w="0" w:type="dxa"/>
-            <w:bottom w:w="0" w:type="dxa"/>
-          </w:tblCellMar>
-        </w:tblPrEx>
         <w:tc>
           <w:tcPr>
             <w:tcW w:w="1600" w:type="dxa"/>
           </w:tcPr>
           <w:p>
+            <w:pPr>
+              <w:jc w:val="both"/>
+            </w:pPr>
             <w:r>
               <w:rPr>
                 <w:sz w:val="18"/>
@@ -2054,6 +2652,9 @@
             <w:tcW w:w="1800" w:type="dxa"/>
           </w:tcPr>
           <w:p>
+            <w:pPr>
+              <w:jc w:val="both"/>
+            </w:pPr>
             <w:r>
               <w:rPr>
                 <w:sz w:val="18"/>
@@ -2068,6 +2669,9 @@
             <w:tcW w:w="1800" w:type="dxa"/>
           </w:tcPr>
           <w:p>
+            <w:pPr>
+              <w:jc w:val="both"/>
+            </w:pPr>
             <w:r>
               <w:rPr>
                 <w:sz w:val="18"/>
@@ -2082,6 +2686,9 @@
             <w:tcW w:w="2000" w:type="dxa"/>
           </w:tcPr>
           <w:p>
+            <w:pPr>
+              <w:jc w:val="both"/>
+            </w:pPr>
             <w:r>
               <w:rPr>
                 <w:sz w:val="18"/>
@@ -2096,6 +2703,9 @@
             <w:tcW w:w="1800" w:type="dxa"/>
           </w:tcPr>
           <w:p>
+            <w:pPr>
+              <w:jc w:val="both"/>
+            </w:pPr>
             <w:r>
               <w:rPr>
                 <w:sz w:val="18"/>
@@ -2107,18 +2717,15 @@
         </w:tc>
       </w:tr>
       <w:tr>
-        <w:tblPrEx>
-          <w:tblCellMar>
-            <w:top w:w="0" w:type="dxa"/>
-            <w:bottom w:w="0" w:type="dxa"/>
-          </w:tblCellMar>
-        </w:tblPrEx>
         <w:tc>
           <w:tcPr>
             <w:tcW w:w="1600" w:type="dxa"/>
             <w:shd w:val="clear" w:color="auto" w:fill="F0F4F2"/>
           </w:tcPr>
           <w:p>
+            <w:pPr>
+              <w:jc w:val="both"/>
+            </w:pPr>
             <w:r>
               <w:rPr>
                 <w:sz w:val="18"/>
@@ -2134,6 +2741,9 @@
             <w:shd w:val="clear" w:color="auto" w:fill="F0F4F2"/>
           </w:tcPr>
           <w:p>
+            <w:pPr>
+              <w:jc w:val="both"/>
+            </w:pPr>
             <w:r>
               <w:rPr>
                 <w:sz w:val="18"/>
@@ -2149,6 +2759,9 @@
             <w:shd w:val="clear" w:color="auto" w:fill="F0F4F2"/>
           </w:tcPr>
           <w:p>
+            <w:pPr>
+              <w:jc w:val="both"/>
+            </w:pPr>
             <w:r>
               <w:rPr>
                 <w:sz w:val="18"/>
@@ -2164,6 +2777,9 @@
             <w:shd w:val="clear" w:color="auto" w:fill="F0F4F2"/>
           </w:tcPr>
           <w:p>
+            <w:pPr>
+              <w:jc w:val="both"/>
+            </w:pPr>
             <w:r>
               <w:rPr>
                 <w:sz w:val="18"/>
@@ -2179,6 +2795,9 @@
             <w:shd w:val="clear" w:color="auto" w:fill="F0F4F2"/>
           </w:tcPr>
           <w:p>
+            <w:pPr>
+              <w:jc w:val="both"/>
+            </w:pPr>
             <w:r>
               <w:rPr>
                 <w:sz w:val="18"/>
@@ -2190,17 +2809,14 @@
         </w:tc>
       </w:tr>
       <w:tr>
-        <w:tblPrEx>
-          <w:tblCellMar>
-            <w:top w:w="0" w:type="dxa"/>
-            <w:bottom w:w="0" w:type="dxa"/>
-          </w:tblCellMar>
-        </w:tblPrEx>
         <w:tc>
           <w:tcPr>
             <w:tcW w:w="1600" w:type="dxa"/>
           </w:tcPr>
           <w:p>
+            <w:pPr>
+              <w:jc w:val="both"/>
+            </w:pPr>
             <w:r>
               <w:rPr>
                 <w:sz w:val="18"/>
@@ -2215,6 +2831,9 @@
             <w:tcW w:w="1800" w:type="dxa"/>
           </w:tcPr>
           <w:p>
+            <w:pPr>
+              <w:jc w:val="both"/>
+            </w:pPr>
             <w:r>
               <w:rPr>
                 <w:sz w:val="18"/>
@@ -2229,6 +2848,9 @@
             <w:tcW w:w="1800" w:type="dxa"/>
           </w:tcPr>
           <w:p>
+            <w:pPr>
+              <w:jc w:val="both"/>
+            </w:pPr>
             <w:r>
               <w:rPr>
                 <w:sz w:val="18"/>
@@ -2243,6 +2865,9 @@
             <w:tcW w:w="2000" w:type="dxa"/>
           </w:tcPr>
           <w:p>
+            <w:pPr>
+              <w:jc w:val="both"/>
+            </w:pPr>
             <w:r>
               <w:rPr>
                 <w:sz w:val="18"/>
@@ -2257,6 +2882,9 @@
             <w:tcW w:w="1800" w:type="dxa"/>
           </w:tcPr>
           <w:p>
+            <w:pPr>
+              <w:jc w:val="both"/>
+            </w:pPr>
             <w:r>
               <w:rPr>
                 <w:sz w:val="18"/>
@@ -2271,6 +2899,7 @@
     <w:p>
       <w:pPr>
         <w:spacing w:after="160"/>
+        <w:jc w:val="both"/>
       </w:pPr>
     </w:p>
     <w:p>
@@ -2282,93 +2911,11 @@
         <w:rPr>
           <w:noProof/>
         </w:rPr>
-        <w:lastRenderedPageBreak/>
         <w:drawing>
           <wp:inline distT="0" distB="0" distL="0" distR="0" wp14:anchorId="56C99083" wp14:editId="56C99084">
             <wp:extent cx="5334000" cy="3857625"/>
             <wp:effectExtent l="0" t="0" r="0" b="0"/>
             <wp:docPr id="2083772860" name="Picture 2083772860"/>
-            <wp:cNvGraphicFramePr>
-              <a:graphicFrameLocks xmlns:a="http://schemas.openxmlformats.org/drawingml/2006/main" noChangeAspect="1"/>
-            </wp:cNvGraphicFramePr>
-            <a:graphic xmlns:a="http://schemas.openxmlformats.org/drawingml/2006/main">
-              <a:graphicData uri="http://schemas.openxmlformats.org/drawingml/2006/picture">
-                <pic:pic xmlns:pic="http://schemas.openxmlformats.org/drawingml/2006/picture">
-                  <pic:nvPicPr>
-                    <pic:cNvPr id="0" name=""/>
-                    <pic:cNvPicPr>
-                      <a:picLocks noChangeAspect="1" noChangeArrowheads="1"/>
-                    </pic:cNvPicPr>
-                  </pic:nvPicPr>
-                  <pic:blipFill>
-                    <a:blip r:embed="rId10"/>
-                    <a:srcRect/>
-                    <a:stretch>
-                      <a:fillRect/>
-                    </a:stretch>
-                  </pic:blipFill>
-                  <pic:spPr bwMode="auto">
-                    <a:xfrm>
-                      <a:off x="0" y="0"/>
-                      <a:ext cx="5334000" cy="3857625"/>
-                    </a:xfrm>
-                    <a:prstGeom prst="rect">
-                      <a:avLst/>
-                    </a:prstGeom>
-                  </pic:spPr>
-                </pic:pic>
-              </a:graphicData>
-            </a:graphic>
-          </wp:inline>
-        </w:drawing>
-      </w:r>
-    </w:p>
-    <w:p>
-      <w:pPr>
-        <w:spacing w:after="240"/>
-        <w:jc w:val="center"/>
-      </w:pPr>
-      <w:r>
-        <w:rPr>
-          <w:i/>
-          <w:iCs/>
-          <w:sz w:val="18"/>
-          <w:szCs w:val="18"/>
-        </w:rPr>
-        <w:t>Figure 4. Boxplots of each numeric variable by species.</w:t>
-      </w:r>
-    </w:p>
-    <w:p>
-      <w:pPr>
-        <w:spacing w:after="120"/>
-      </w:pPr>
-      <w:r>
-        <w:t>Species is the dominant source of variation in this dataset. Gentoo penguins are markedly larger (body mass, flipper length) but have notably shallower bills than the other two species. Adelie has the shortest bill length; Chinstrap and Gentoo have similar bill lengths but very different bill depths and body sizes. A one-way ANOVA confirms these differences are statistically significant for body mass (F = 343.6, p &lt; 0.001) and bill length (F = 410.6, p &lt; 0.001).</w:t>
-      </w:r>
-    </w:p>
-    <w:p>
-      <w:pPr>
-        <w:pStyle w:val="Heading2"/>
-        <w:spacing w:before="280" w:after="140"/>
-      </w:pPr>
-      <w:r>
-        <w:t>6.2 By Island</w:t>
-      </w:r>
-    </w:p>
-    <w:p>
-      <w:pPr>
-        <w:spacing w:after="60"/>
-        <w:jc w:val="center"/>
-      </w:pPr>
-      <w:r>
-        <w:rPr>
-          <w:noProof/>
-        </w:rPr>
-        <w:drawing>
-          <wp:inline distT="0" distB="0" distL="0" distR="0" wp14:anchorId="56C99085" wp14:editId="56C99086">
-            <wp:extent cx="4572000" cy="2819400"/>
-            <wp:effectExtent l="0" t="0" r="0" b="0"/>
-            <wp:docPr id="1806519789" name="Picture 1806519789"/>
             <wp:cNvGraphicFramePr>
               <a:graphicFrameLocks xmlns:a="http://schemas.openxmlformats.org/drawingml/2006/main" noChangeAspect="1"/>
             </wp:cNvGraphicFramePr>
@@ -2391,7 +2938,7 @@
                   <pic:spPr bwMode="auto">
                     <a:xfrm>
                       <a:off x="0" y="0"/>
-                      <a:ext cx="4572000" cy="2819400"/>
+                      <a:ext cx="5334000" cy="3857625"/>
                     </a:xfrm>
                     <a:prstGeom prst="rect">
                       <a:avLst/>
@@ -2416,28 +2963,87 @@
           <w:sz w:val="18"/>
           <w:szCs w:val="18"/>
         </w:rPr>
-        <w:t>Figure 5. Species composition by island.</w:t>
-      </w:r>
-    </w:p>
-    <w:p>
-      <w:pPr>
-        <w:spacing w:after="120"/>
-      </w:pPr>
-      <w:r>
-        <w:t xml:space="preserve">Island is not an independent grouping factor — it is almost a proxy for species. Torgersen contains only Adelie penguins, Dream contains Adelie and Chinstrap, and Biscoe contains Adelie and Gentoo. As a result, apparent differences in </w:t>
-      </w:r>
-      <w:r>
-        <w:lastRenderedPageBreak/>
-        <w:t>measurements 'by island' (e.g., higher average body mass on Biscoe) are largely driven by which species happen to live there, rather than an island effect in itself.</w:t>
-      </w:r>
+        <w:t>Figure 4. Boxplots of each numeric variable by species.</w:t>
+      </w:r>
+    </w:p>
+    <w:p>
+      <w:pPr>
+        <w:spacing w:after="120"/>
+        <w:jc w:val="both"/>
+      </w:pPr>
+      <w:r>
+        <w:t>Species is the dominant source of variation in this dataset. Gentoo penguins are markedly larger (body mass, flipper length) but have notably shallower bills than the other two species. Adelie has the shortest bill length; Chinstrap and Gentoo have similar bill lengths but very different bill depths and body sizes. A one-way ANOVA confirms these differences are statistically significant for body mass (F = 343.6, p &lt; 0.001) and bill length (F = 410.6, p &lt; 0.001).</w:t>
+      </w:r>
+    </w:p>
+    <w:p>
+      <w:pPr>
+        <w:spacing w:after="120"/>
+        <w:jc w:val="both"/>
+      </w:pPr>
+    </w:p>
+    <w:p>
+      <w:pPr>
+        <w:spacing w:after="120"/>
+        <w:jc w:val="both"/>
+      </w:pPr>
+    </w:p>
+    <w:p>
+      <w:pPr>
+        <w:spacing w:after="120"/>
+        <w:jc w:val="both"/>
+      </w:pPr>
+    </w:p>
+    <w:p>
+      <w:pPr>
+        <w:spacing w:after="120"/>
+        <w:jc w:val="both"/>
+      </w:pPr>
+    </w:p>
+    <w:p>
+      <w:pPr>
+        <w:spacing w:after="120"/>
+        <w:jc w:val="both"/>
+      </w:pPr>
+    </w:p>
+    <w:p>
+      <w:pPr>
+        <w:spacing w:after="120"/>
+        <w:jc w:val="both"/>
+      </w:pPr>
+    </w:p>
+    <w:p>
+      <w:pPr>
+        <w:spacing w:after="120"/>
+        <w:jc w:val="both"/>
+      </w:pPr>
+    </w:p>
+    <w:p>
+      <w:pPr>
+        <w:spacing w:after="120"/>
+        <w:jc w:val="both"/>
+      </w:pPr>
+    </w:p>
+    <w:p>
+      <w:pPr>
+        <w:spacing w:after="120"/>
+        <w:jc w:val="both"/>
+      </w:pPr>
+    </w:p>
+    <w:p>
+      <w:pPr>
+        <w:spacing w:after="120"/>
+        <w:jc w:val="both"/>
+      </w:pPr>
     </w:p>
     <w:p>
       <w:pPr>
         <w:pStyle w:val="Heading2"/>
         <w:spacing w:before="280" w:after="140"/>
-      </w:pPr>
-      <w:r>
-        <w:t>6.3 By Sex</w:t>
+        <w:jc w:val="both"/>
+      </w:pPr>
+      <w:r>
+        <w:lastRenderedPageBreak/>
+        <w:t>6.2 By Island</w:t>
       </w:r>
     </w:p>
     <w:p>
@@ -2450,10 +3056,10 @@
           <w:noProof/>
         </w:rPr>
         <w:drawing>
-          <wp:inline distT="0" distB="0" distL="0" distR="0" wp14:anchorId="56C99087" wp14:editId="56C99088">
+          <wp:inline distT="0" distB="0" distL="0" distR="0" wp14:anchorId="56C99085" wp14:editId="56C99086">
             <wp:extent cx="4572000" cy="2819400"/>
             <wp:effectExtent l="0" t="0" r="0" b="0"/>
-            <wp:docPr id="2102954973" name="Picture 2102954973"/>
+            <wp:docPr id="1806519789" name="Picture 1806519789"/>
             <wp:cNvGraphicFramePr>
               <a:graphicFrameLocks xmlns:a="http://schemas.openxmlformats.org/drawingml/2006/main" noChangeAspect="1"/>
             </wp:cNvGraphicFramePr>
@@ -2501,122 +3107,39 @@
           <w:sz w:val="18"/>
           <w:szCs w:val="18"/>
         </w:rPr>
-        <w:t>Figure 6. Mean body mass by species and sex, with standard deviation error bars.</w:t>
-      </w:r>
-    </w:p>
-    <w:p>
-      <w:pPr>
-        <w:spacing w:after="120"/>
-      </w:pPr>
-      <w:r>
-        <w:t>Within every species, males are consistently heavier than females — a pattern known as sexual size dimorphism. The gap is present across all three species, meaning sex and species act as independent, additive sources of variation in body mass rather than one masking the other.</w:t>
-      </w:r>
-    </w:p>
-    <w:p>
-      <w:pPr>
-        <w:spacing w:after="120"/>
-      </w:pPr>
-    </w:p>
-    <w:p>
-      <w:pPr>
-        <w:spacing w:after="120"/>
-      </w:pPr>
-    </w:p>
-    <w:p>
-      <w:pPr>
-        <w:spacing w:after="120"/>
-      </w:pPr>
-    </w:p>
-    <w:p>
-      <w:pPr>
-        <w:spacing w:after="120"/>
-      </w:pPr>
-    </w:p>
-    <w:p>
-      <w:pPr>
-        <w:spacing w:after="120"/>
-      </w:pPr>
-    </w:p>
-    <w:p>
-      <w:pPr>
-        <w:spacing w:after="120"/>
-      </w:pPr>
-    </w:p>
-    <w:p>
-      <w:pPr>
-        <w:spacing w:after="120"/>
-      </w:pPr>
-    </w:p>
-    <w:p>
-      <w:pPr>
-        <w:spacing w:after="120"/>
-      </w:pPr>
-    </w:p>
-    <w:p>
-      <w:pPr>
-        <w:spacing w:after="120"/>
-      </w:pPr>
-    </w:p>
-    <w:p>
-      <w:pPr>
-        <w:spacing w:after="120"/>
-      </w:pPr>
-    </w:p>
-    <w:p>
-      <w:pPr>
-        <w:spacing w:after="120"/>
-      </w:pPr>
-    </w:p>
-    <w:p>
-      <w:pPr>
-        <w:spacing w:after="120"/>
-      </w:pPr>
-    </w:p>
-    <w:p>
-      <w:pPr>
-        <w:spacing w:after="120"/>
-      </w:pPr>
-    </w:p>
-    <w:p>
-      <w:pPr>
-        <w:spacing w:after="120"/>
-      </w:pPr>
-    </w:p>
-    <w:p>
-      <w:pPr>
-        <w:spacing w:after="120"/>
-      </w:pPr>
-    </w:p>
-    <w:p>
-      <w:pPr>
-        <w:spacing w:after="120"/>
-      </w:pPr>
-    </w:p>
-    <w:p>
-      <w:pPr>
-        <w:spacing w:after="120"/>
-      </w:pPr>
-    </w:p>
-    <w:p>
-      <w:pPr>
-        <w:spacing w:after="120"/>
-      </w:pPr>
+        <w:t>Figure 5. Species composition by island.</w:t>
+      </w:r>
+    </w:p>
+    <w:p>
+      <w:pPr>
+        <w:spacing w:after="120"/>
+        <w:jc w:val="both"/>
+      </w:pPr>
+      <w:r>
+        <w:t>Island is not an independent grouping factor</w:t>
+      </w:r>
+      <w:r>
+        <w:t>. I</w:t>
+      </w:r>
+      <w:r>
+        <w:t xml:space="preserve">t is almost a proxy for species. Torgersen contains only Adelie penguins, Dream contains Adelie and Chinstrap, and Biscoe contains Adelie and Gentoo. As a result, apparent differences in measurements 'by island' (e.g., higher average body mass on Biscoe) are largely driven by which species happen to live there, rather than an island </w:t>
+      </w:r>
+      <w:r>
+        <w:t>effect</w:t>
+      </w:r>
+      <w:r>
+        <w:t>.</w:t>
+      </w:r>
     </w:p>
     <w:p>
       <w:pPr>
         <w:pStyle w:val="Heading2"/>
         <w:spacing w:before="280" w:after="140"/>
-      </w:pPr>
-      <w:r>
-        <w:lastRenderedPageBreak/>
-        <w:t>6.4 Pairwise Relationships</w:t>
-      </w:r>
-    </w:p>
-    <w:p>
-      <w:pPr>
-        <w:pStyle w:val="Heading2"/>
-        <w:spacing w:before="280" w:after="140"/>
-      </w:pPr>
+        <w:jc w:val="both"/>
+      </w:pPr>
+      <w:r>
+        <w:t>6.3 By Sex</w:t>
+      </w:r>
     </w:p>
     <w:p>
       <w:pPr>
@@ -2628,10 +3151,10 @@
           <w:noProof/>
         </w:rPr>
         <w:drawing>
-          <wp:inline distT="0" distB="0" distL="0" distR="0" wp14:anchorId="56C99089" wp14:editId="56C9908A">
-            <wp:extent cx="5715000" cy="5105400"/>
+          <wp:inline distT="0" distB="0" distL="0" distR="0" wp14:anchorId="56C99087" wp14:editId="56C99088">
+            <wp:extent cx="4572000" cy="2819400"/>
             <wp:effectExtent l="0" t="0" r="0" b="0"/>
-            <wp:docPr id="1385871906" name="Picture 1385871906"/>
+            <wp:docPr id="2102954973" name="Picture 2102954973"/>
             <wp:cNvGraphicFramePr>
               <a:graphicFrameLocks xmlns:a="http://schemas.openxmlformats.org/drawingml/2006/main" noChangeAspect="1"/>
             </wp:cNvGraphicFramePr>
@@ -2654,7 +3177,7 @@
                   <pic:spPr bwMode="auto">
                     <a:xfrm>
                       <a:off x="0" y="0"/>
-                      <a:ext cx="5715000" cy="5105400"/>
+                      <a:ext cx="4572000" cy="2819400"/>
                     </a:xfrm>
                     <a:prstGeom prst="rect">
                       <a:avLst/>
@@ -2679,9 +3202,106 @@
           <w:sz w:val="18"/>
           <w:szCs w:val="18"/>
         </w:rPr>
-        <w:t xml:space="preserve">Figure 7. Pairwise scatterplots and marginal distributions for all numeric variables, </w:t>
-      </w:r>
-      <w:proofErr w:type="spellStart"/>
+        <w:t>Figure 6. Mean body mass by species and sex, with standard deviation error bars.</w:t>
+      </w:r>
+    </w:p>
+    <w:p>
+      <w:pPr>
+        <w:spacing w:after="120"/>
+        <w:jc w:val="both"/>
+      </w:pPr>
+      <w:r>
+        <w:t>Within every species, males are consistently heavier than females</w:t>
+      </w:r>
+      <w:r>
+        <w:t xml:space="preserve">. A </w:t>
+      </w:r>
+      <w:r>
+        <w:t>pattern known as sexual size dimorphism. The gap is present across all three species, meaning sex and species act as independent, additive sources of variation in body mass rather than one masking the other.</w:t>
+      </w:r>
+    </w:p>
+    <w:p>
+      <w:pPr>
+        <w:spacing w:after="120"/>
+        <w:jc w:val="both"/>
+      </w:pPr>
+    </w:p>
+    <w:p>
+      <w:pPr>
+        <w:spacing w:after="120"/>
+        <w:jc w:val="both"/>
+      </w:pPr>
+    </w:p>
+    <w:p>
+      <w:pPr>
+        <w:pStyle w:val="Heading2"/>
+        <w:spacing w:before="280" w:after="140"/>
+        <w:jc w:val="both"/>
+      </w:pPr>
+      <w:r>
+        <w:lastRenderedPageBreak/>
+        <w:t>6.4 Pairwise Relationships</w:t>
+      </w:r>
+    </w:p>
+    <w:p>
+      <w:pPr>
+        <w:spacing w:after="60"/>
+        <w:jc w:val="center"/>
+      </w:pPr>
+      <w:r>
+        <w:rPr>
+          <w:noProof/>
+        </w:rPr>
+        <w:drawing>
+          <wp:inline distT="0" distB="0" distL="0" distR="0" wp14:anchorId="56C99089" wp14:editId="0E5DE397">
+            <wp:extent cx="5715000" cy="5105400"/>
+            <wp:effectExtent l="19050" t="19050" r="19050" b="19050"/>
+            <wp:docPr id="1385871906" name="Picture 1385871906"/>
+            <wp:cNvGraphicFramePr>
+              <a:graphicFrameLocks xmlns:a="http://schemas.openxmlformats.org/drawingml/2006/main" noChangeAspect="1"/>
+            </wp:cNvGraphicFramePr>
+            <a:graphic xmlns:a="http://schemas.openxmlformats.org/drawingml/2006/main">
+              <a:graphicData uri="http://schemas.openxmlformats.org/drawingml/2006/picture">
+                <pic:pic xmlns:pic="http://schemas.openxmlformats.org/drawingml/2006/picture">
+                  <pic:nvPicPr>
+                    <pic:cNvPr id="0" name=""/>
+                    <pic:cNvPicPr>
+                      <a:picLocks noChangeAspect="1" noChangeArrowheads="1"/>
+                    </pic:cNvPicPr>
+                  </pic:nvPicPr>
+                  <pic:blipFill>
+                    <a:blip r:embed="rId14"/>
+                    <a:srcRect/>
+                    <a:stretch>
+                      <a:fillRect/>
+                    </a:stretch>
+                  </pic:blipFill>
+                  <pic:spPr bwMode="auto">
+                    <a:xfrm>
+                      <a:off x="0" y="0"/>
+                      <a:ext cx="5715000" cy="5105400"/>
+                    </a:xfrm>
+                    <a:prstGeom prst="rect">
+                      <a:avLst/>
+                    </a:prstGeom>
+                    <a:ln>
+                      <a:solidFill>
+                        <a:schemeClr val="accent1"/>
+                      </a:solidFill>
+                    </a:ln>
+                  </pic:spPr>
+                </pic:pic>
+              </a:graphicData>
+            </a:graphic>
+          </wp:inline>
+        </w:drawing>
+      </w:r>
+    </w:p>
+    <w:p>
+      <w:pPr>
+        <w:spacing w:after="240"/>
+        <w:jc w:val="center"/>
+      </w:pPr>
       <w:r>
         <w:rPr>
           <w:i/>
@@ -2689,9 +3309,17 @@
           <w:sz w:val="18"/>
           <w:szCs w:val="18"/>
         </w:rPr>
-        <w:t>coloured</w:t>
-      </w:r>
-      <w:proofErr w:type="spellEnd"/>
+        <w:t xml:space="preserve">Figure 7. Pairwise scatterplots and marginal distributions for all numeric variables, </w:t>
+      </w:r>
+      <w:r>
+        <w:rPr>
+          <w:i/>
+          <w:iCs/>
+          <w:sz w:val="18"/>
+          <w:szCs w:val="18"/>
+        </w:rPr>
+        <w:t>colored</w:t>
+      </w:r>
       <w:r>
         <w:rPr>
           <w:i/>
@@ -2705,15 +3333,14 @@
     <w:p>
       <w:pPr>
         <w:spacing w:after="120"/>
+        <w:jc w:val="both"/>
       </w:pPr>
       <w:r>
         <w:t xml:space="preserve">The </w:t>
       </w:r>
-      <w:proofErr w:type="spellStart"/>
-      <w:r>
-        <w:t>pairplot</w:t>
-      </w:r>
-      <w:proofErr w:type="spellEnd"/>
+      <w:r>
+        <w:t>pair plot</w:t>
+      </w:r>
       <w:r>
         <w:t xml:space="preserve"> shows that combinations of just two variables (e.g., bill length and bill depth, or flipper length and bill depth) are enough to separate the three species almost perfectly into distinct clusters. This suggests the four numeric measurements together carry strong discriminative information about species identity.</w:t>
       </w:r>
@@ -2721,52 +3348,68 @@
     <w:p>
       <w:pPr>
         <w:spacing w:after="120"/>
-      </w:pPr>
-    </w:p>
-    <w:p>
-      <w:pPr>
-        <w:spacing w:after="120"/>
-      </w:pPr>
-    </w:p>
-    <w:p>
-      <w:pPr>
-        <w:spacing w:after="120"/>
-      </w:pPr>
-    </w:p>
-    <w:p>
-      <w:pPr>
-        <w:spacing w:after="120"/>
-      </w:pPr>
-    </w:p>
-    <w:p>
-      <w:pPr>
-        <w:spacing w:after="120"/>
-      </w:pPr>
-    </w:p>
-    <w:p>
-      <w:pPr>
-        <w:spacing w:after="120"/>
-      </w:pPr>
-    </w:p>
-    <w:p>
-      <w:pPr>
-        <w:spacing w:after="120"/>
-      </w:pPr>
-    </w:p>
-    <w:p>
-      <w:pPr>
-        <w:spacing w:after="120"/>
-      </w:pPr>
-    </w:p>
-    <w:p>
-      <w:pPr>
-        <w:spacing w:after="120"/>
+        <w:jc w:val="both"/>
+      </w:pPr>
+    </w:p>
+    <w:p>
+      <w:pPr>
+        <w:spacing w:after="120"/>
+        <w:jc w:val="both"/>
+      </w:pPr>
+    </w:p>
+    <w:p>
+      <w:pPr>
+        <w:spacing w:after="120"/>
+        <w:jc w:val="both"/>
+      </w:pPr>
+    </w:p>
+    <w:p>
+      <w:pPr>
+        <w:spacing w:after="120"/>
+        <w:jc w:val="both"/>
+      </w:pPr>
+    </w:p>
+    <w:p>
+      <w:pPr>
+        <w:spacing w:after="120"/>
+        <w:jc w:val="both"/>
+      </w:pPr>
+    </w:p>
+    <w:p>
+      <w:pPr>
+        <w:spacing w:after="120"/>
+        <w:jc w:val="both"/>
+      </w:pPr>
+    </w:p>
+    <w:p>
+      <w:pPr>
+        <w:spacing w:after="120"/>
+        <w:jc w:val="both"/>
+      </w:pPr>
+    </w:p>
+    <w:p>
+      <w:pPr>
+        <w:spacing w:after="120"/>
+        <w:jc w:val="both"/>
+      </w:pPr>
+    </w:p>
+    <w:p>
+      <w:pPr>
+        <w:spacing w:after="120"/>
+        <w:jc w:val="both"/>
+      </w:pPr>
+    </w:p>
+    <w:p>
+      <w:pPr>
+        <w:spacing w:after="120"/>
+        <w:jc w:val="both"/>
       </w:pPr>
     </w:p>
     <w:p>
       <w:pPr>
         <w:pStyle w:val="Heading1"/>
         <w:spacing w:before="280" w:after="140"/>
+        <w:jc w:val="both"/>
       </w:pPr>
       <w:r>
         <w:lastRenderedPageBreak/>
@@ -2775,92 +3418,72 @@
     </w:p>
     <w:p>
       <w:pPr>
-        <w:pStyle w:val="ListParagraph"/>
-        <w:numPr>
-          <w:ilvl w:val="0"/>
-          <w:numId w:val="1"/>
-        </w:numPr>
         <w:spacing w:after="60"/>
-      </w:pPr>
-      <w:r>
-        <w:t>Species is the primary driver of variation in all four numeric variables. Gentoo penguins are distinctly larger with shallower bills; Adelie has the shortest bills; Chinstrap sits between Adelie and Gentoo on most measures but overlaps closely with Gentoo on bill length.</w:t>
-      </w:r>
-    </w:p>
-    <w:p>
-      <w:pPr>
-        <w:pStyle w:val="ListParagraph"/>
-        <w:numPr>
-          <w:ilvl w:val="0"/>
-          <w:numId w:val="1"/>
-        </w:numPr>
+        <w:jc w:val="both"/>
+      </w:pPr>
+      <w:r>
+        <w:t>When we look at variations in certain traits, it's clear that the species of penguins are the main influence on these differences. For example, Gentoo penguins stand out as being larger and having shallower bills compared to the others. On the other hand, Adelie penguins have the shortest bills, while Chinstrap penguins fall somewhere in between, although they share some similarities with Gentoo in terms of bill length.</w:t>
+      </w:r>
+    </w:p>
+    <w:p>
+      <w:pPr>
         <w:spacing w:after="60"/>
-      </w:pPr>
-      <w:r>
-        <w:t>Island differences are confounded with species — each island hosts a different subset of species, so island-level averages mainly reflect species composition rather than a geographic effect.</w:t>
-      </w:r>
-    </w:p>
-    <w:p>
-      <w:pPr>
-        <w:pStyle w:val="ListParagraph"/>
-        <w:numPr>
-          <w:ilvl w:val="0"/>
-          <w:numId w:val="1"/>
-        </w:numPr>
+        <w:jc w:val="both"/>
+      </w:pPr>
+      <w:r>
+        <w:t>It's important to note that the differences we see among islands are closely tied to the species that inhabit them; each island is home to a unique mix of penguin species. So, when we look at averages from different islands, we're really seeing the impact of which species are present rather than a true geographic effect.</w:t>
+      </w:r>
+    </w:p>
+    <w:p>
+      <w:pPr>
         <w:spacing w:after="60"/>
-      </w:pPr>
-      <w:r>
-        <w:t>Sex creates a consistent, additive effect: males are heavier than females within every species, indicating sexual dimorphism independent of species differences.</w:t>
-      </w:r>
-    </w:p>
-    <w:p>
-      <w:pPr>
-        <w:pStyle w:val="ListParagraph"/>
-        <w:numPr>
-          <w:ilvl w:val="0"/>
-          <w:numId w:val="1"/>
-        </w:numPr>
+        <w:jc w:val="both"/>
+      </w:pPr>
+      <w:r>
+        <w:t xml:space="preserve">Sex also plays a significant role in their characteristics. Male penguins tend to be heavier than females across all species, showing a consistent pattern known as sexual dimorphism. </w:t>
+      </w:r>
+    </w:p>
+    <w:p>
+      <w:pPr>
         <w:spacing w:after="60"/>
-      </w:pPr>
-      <w:r>
-        <w:t>Flipper length and body mass are strongly correlated (larger-bodied birds have longer flippers), while bill depth behaves almost inversely to overall body size across species — driven by Gentoo's unusually shallow bill relative to its large body.</w:t>
-      </w:r>
-    </w:p>
-    <w:p>
-      <w:pPr>
-        <w:pStyle w:val="ListParagraph"/>
-        <w:numPr>
-          <w:ilvl w:val="0"/>
-          <w:numId w:val="1"/>
-        </w:numPr>
+        <w:jc w:val="both"/>
+      </w:pPr>
+      <w:r>
+        <w:t>In terms of physical traits, there’s a strong connection between flipper length and body mass</w:t>
+      </w:r>
+      <w:r>
+        <w:t>. L</w:t>
+      </w:r>
+      <w:r>
+        <w:t>arger penguins generally have longer flippers. Interestingly, bill depth behaves differently; it often decreases as overall body size increases, particularly due to Gentoo penguins’ relatively shallow bills compared to their larger bodies.</w:t>
+      </w:r>
+    </w:p>
+    <w:p>
+      <w:pPr>
         <w:spacing w:after="60"/>
-      </w:pPr>
-      <w:r>
-        <w:t>All four numeric variables are reasonably symmetric (low skew) but flatter than a normal distribution (negative kurtosis), which is explained by the underlying three-species mixture rather than any single well-behaved population distribution.</w:t>
-      </w:r>
-    </w:p>
-    <w:p>
-      <w:pPr>
-        <w:pStyle w:val="ListParagraph"/>
-        <w:numPr>
-          <w:ilvl w:val="0"/>
-          <w:numId w:val="1"/>
-        </w:numPr>
+        <w:jc w:val="both"/>
+      </w:pPr>
+      <w:r>
+        <w:t>When we analyze the data, we find that the distribution of these measurements tends to be symmetrical but doesn’t resemble a typical bell curve; it's a bit flatter than that. This pattern is primarily due to the mix of three different species, rather than any single group that behaves like a well-defined population.</w:t>
+      </w:r>
+    </w:p>
+    <w:p>
+      <w:pPr>
         <w:spacing w:after="60"/>
-      </w:pPr>
-      <w:r>
-        <w:t xml:space="preserve">Practical implication: species can be predicted with high accuracy from just two of the four numeric measurements (e.g., bill length and bill depth), as shown in the </w:t>
-      </w:r>
-      <w:proofErr w:type="spellStart"/>
-      <w:r>
-        <w:t>pairplot</w:t>
-      </w:r>
-      <w:proofErr w:type="spellEnd"/>
-      <w:r>
-        <w:t xml:space="preserve"> clustering — a useful basis for a simple classification exercise as a follow-up to this descriptive analysis.</w:t>
+        <w:jc w:val="both"/>
+      </w:pPr>
+      <w:r>
+        <w:t xml:space="preserve">In practical terms, this means that we can accurately predict a penguin's species by looking at just two of the four key measurements, like bill length and bill depth. This insight, backed by the pair plot clustering we observed, </w:t>
+      </w:r>
+      <w:r>
+        <w:t>opens</w:t>
+      </w:r>
+      <w:r>
+        <w:t xml:space="preserve"> opportunities for a simple classification exercise to further explore these findings.</w:t>
       </w:r>
     </w:p>
     <w:sectPr>
-      <w:footerReference w:type="default" r:id="rId14"/>
+      <w:footerReference w:type="default" r:id="rId15"/>
       <w:pgSz w:w="12240" w:h="15840"/>
       <w:pgMar w:top="1080" w:right="1080" w:bottom="1080" w:left="1080" w:header="708" w:footer="708" w:gutter="0"/>
       <w:cols w:space="720"/>
@@ -3024,11 +3647,107 @@
       </w:pPr>
     </w:lvl>
   </w:abstractNum>
+  <w:abstractNum w:abstractNumId="1" w15:restartNumberingAfterBreak="0">
+    <w:nsid w:val="3A260F84"/>
+    <w:multiLevelType w:val="hybridMultilevel"/>
+    <w:tmpl w:val="7F787CB8"/>
+    <w:lvl w:ilvl="0" w:tplc="45F89B1A">
+      <w:start w:val="1"/>
+      <w:numFmt w:val="decimal"/>
+      <w:lvlText w:val="%1."/>
+      <w:lvlJc w:val="left"/>
+      <w:pPr>
+        <w:ind w:left="630" w:hanging="360"/>
+      </w:pPr>
+      <w:rPr>
+        <w:b/>
+        <w:bCs/>
+      </w:rPr>
+    </w:lvl>
+    <w:lvl w:ilvl="1" w:tplc="FFFFFFFF">
+      <w:start w:val="1"/>
+      <w:numFmt w:val="bullet"/>
+      <w:lvlText w:val="○"/>
+      <w:lvlJc w:val="left"/>
+      <w:pPr>
+        <w:ind w:left="1440" w:hanging="360"/>
+      </w:pPr>
+    </w:lvl>
+    <w:lvl w:ilvl="2" w:tplc="FFFFFFFF">
+      <w:start w:val="1"/>
+      <w:numFmt w:val="bullet"/>
+      <w:lvlText w:val="■"/>
+      <w:lvlJc w:val="left"/>
+      <w:pPr>
+        <w:ind w:left="2160" w:hanging="360"/>
+      </w:pPr>
+    </w:lvl>
+    <w:lvl w:ilvl="3" w:tplc="FFFFFFFF">
+      <w:start w:val="1"/>
+      <w:numFmt w:val="bullet"/>
+      <w:lvlText w:val="●"/>
+      <w:lvlJc w:val="left"/>
+      <w:pPr>
+        <w:ind w:left="2880" w:hanging="360"/>
+      </w:pPr>
+    </w:lvl>
+    <w:lvl w:ilvl="4" w:tplc="FFFFFFFF">
+      <w:start w:val="1"/>
+      <w:numFmt w:val="bullet"/>
+      <w:lvlText w:val="○"/>
+      <w:lvlJc w:val="left"/>
+      <w:pPr>
+        <w:ind w:left="3600" w:hanging="360"/>
+      </w:pPr>
+    </w:lvl>
+    <w:lvl w:ilvl="5" w:tplc="FFFFFFFF">
+      <w:start w:val="1"/>
+      <w:numFmt w:val="bullet"/>
+      <w:lvlText w:val="■"/>
+      <w:lvlJc w:val="left"/>
+      <w:pPr>
+        <w:ind w:left="4320" w:hanging="360"/>
+      </w:pPr>
+    </w:lvl>
+    <w:lvl w:ilvl="6" w:tplc="FFFFFFFF">
+      <w:start w:val="1"/>
+      <w:numFmt w:val="bullet"/>
+      <w:lvlText w:val="●"/>
+      <w:lvlJc w:val="left"/>
+      <w:pPr>
+        <w:ind w:left="5040" w:hanging="360"/>
+      </w:pPr>
+    </w:lvl>
+    <w:lvl w:ilvl="7" w:tplc="FFFFFFFF">
+      <w:start w:val="1"/>
+      <w:numFmt w:val="bullet"/>
+      <w:lvlText w:val="●"/>
+      <w:lvlJc w:val="left"/>
+      <w:pPr>
+        <w:ind w:left="5760" w:hanging="360"/>
+      </w:pPr>
+    </w:lvl>
+    <w:lvl w:ilvl="8" w:tplc="FFFFFFFF">
+      <w:start w:val="1"/>
+      <w:numFmt w:val="bullet"/>
+      <w:lvlText w:val="●"/>
+      <w:lvlJc w:val="left"/>
+      <w:pPr>
+        <w:ind w:left="6480" w:hanging="360"/>
+      </w:pPr>
+    </w:lvl>
+  </w:abstractNum>
   <w:num w:numId="1" w16cid:durableId="1845315421">
     <w:abstractNumId w:val="0"/>
     <w:lvlOverride w:ilvl="0">
       <w:startOverride w:val="1"/>
     </w:lvlOverride>
+  </w:num>
+  <w:num w:numId="2" w16cid:durableId="2051371957">
+    <w:abstractNumId w:val="0"/>
+  </w:num>
+  <w:num w:numId="3" w16cid:durableId="1757825595">
+    <w:abstractNumId w:val="1"/>
   </w:num>
 </w:numbering>
 </file>
@@ -3512,7 +4231,6 @@
   <w:style w:type="character" w:default="1" w:styleId="DefaultParagraphFont">
     <w:name w:val="Default Paragraph Font"/>
     <w:uiPriority w:val="1"/>
-    <w:semiHidden/>
     <w:unhideWhenUsed/>
   </w:style>
   <w:style w:type="table" w:default="1" w:styleId="TableNormal">
@@ -3618,6 +4336,18 @@
     <w:rPr>
       <w:sz w:val="20"/>
       <w:szCs w:val="20"/>
+    </w:rPr>
+  </w:style>
+  <w:style w:type="character" w:styleId="UnresolvedMention">
+    <w:name w:val="Unresolved Mention"/>
+    <w:basedOn w:val="DefaultParagraphFont"/>
+    <w:uiPriority w:val="99"/>
+    <w:semiHidden/>
+    <w:unhideWhenUsed/>
+    <w:rsid w:val="009B0EEB"/>
+    <w:rPr>
+      <w:color w:val="605E5C"/>
+      <w:shd w:val="clear" w:color="auto" w:fill="E1DFDD"/>
     </w:rPr>
   </w:style>
 </w:styles>

</xml_diff>